<commit_message>
Update thesis with Day 3 changes
</commit_message>
<xml_diff>
--- a/docs/Busani_Ncube-Thesis.docx
+++ b/docs/Busani_Ncube-Thesis.docx
@@ -208,24 +208,1565 @@
     </w:p>
     <w:p>
       <w:pPr>
+        <w:pStyle w:val="Normal"/>
         <w:spacing w:before="240" w:beforeAutospacing="off" w:after="240" w:afterAutospacing="off"/>
         <w:jc w:val="left"/>
-      </w:pPr>
-      <w:r>
-        <w:rPr>
-          <w:rFonts w:ascii="Times New Roman" w:hAnsi="Times New Roman" w:eastAsia="Times New Roman" w:cs="Times New Roman"/>
-          <w:noProof w:val="0"/>
-          <w:sz w:val="24"/>
-          <w:szCs w:val="24"/>
-          <w:lang w:val="en-GB"/>
-        </w:rPr>
-        <w:t>The rapid advancement of embedded systems and the Internet of Things (IoT) has transformed the way people interact with their living environments. Smart home systems have emerged as a practical application of these technologies, enabling automated control of lighting, security, temperature, and access through intelligent embedded devices. Traditional home control systems often rely on single input methods and lack flexibility, making them inaccessible and difficult to use. This project addresses these limitations by developing a low-cost, multi-interface smart home controller using an Arduino Nano microcontroller, demonstrating how embedded systems can be applied to real-world automation challenges relevant to modern IIoT trends.</w:t>
-      </w:r>
-    </w:p>
-    <w:p>
-      <w:pPr>
+        <w:rPr>
+          <w:rFonts w:ascii="Times New Roman" w:hAnsi="Times New Roman" w:eastAsia="Times New Roman" w:cs="Times New Roman"/>
+          <w:b w:val="0"/>
+          <w:bCs w:val="0"/>
+          <w:noProof w:val="0"/>
+          <w:sz w:val="24"/>
+          <w:szCs w:val="24"/>
+          <w:lang w:val="en-GB"/>
+        </w:rPr>
+      </w:pPr>
+      <w:r>
+        <w:rPr>
+          <w:rFonts w:ascii="Times New Roman" w:hAnsi="Times New Roman" w:eastAsia="Times New Roman" w:cs="Times New Roman"/>
+          <w:noProof w:val="0"/>
+          <w:sz w:val="24"/>
+          <w:szCs w:val="24"/>
+          <w:lang w:val="en-GB"/>
+        </w:rPr>
+        <w:t>Home automation broadly refers to the application of systems and technologies to perform household tasks and functions automatically with the primary goal of improving convenience, comfort, and efficiency.[</w:t>
+      </w:r>
+      <w:r>
+        <w:rPr>
+          <w:rFonts w:ascii="Times New Roman" w:hAnsi="Times New Roman" w:eastAsia="Times New Roman" w:cs="Times New Roman"/>
+          <w:noProof w:val="0"/>
+          <w:sz w:val="24"/>
+          <w:szCs w:val="24"/>
+          <w:lang w:val="en-GB"/>
+        </w:rPr>
+        <w:t>3]</w:t>
+      </w:r>
+      <w:r>
+        <w:rPr>
+          <w:rFonts w:ascii="Times New Roman" w:hAnsi="Times New Roman" w:eastAsia="Times New Roman" w:cs="Times New Roman"/>
+          <w:noProof w:val="0"/>
+          <w:sz w:val="24"/>
+          <w:szCs w:val="24"/>
+          <w:lang w:val="en-GB"/>
+        </w:rPr>
+        <w:t xml:space="preserve"> </w:t>
+      </w:r>
+      <w:r>
+        <w:rPr>
+          <w:rFonts w:ascii="Times New Roman" w:hAnsi="Times New Roman" w:eastAsia="Times New Roman" w:cs="Times New Roman"/>
+          <w:noProof w:val="0"/>
+          <w:sz w:val="24"/>
+          <w:szCs w:val="24"/>
+          <w:lang w:val="en-GB"/>
+        </w:rPr>
+        <w:t>The</w:t>
+      </w:r>
+      <w:r>
+        <w:rPr>
+          <w:rFonts w:ascii="Times New Roman" w:hAnsi="Times New Roman" w:eastAsia="Times New Roman" w:cs="Times New Roman"/>
+          <w:noProof w:val="0"/>
+          <w:sz w:val="24"/>
+          <w:szCs w:val="24"/>
+          <w:lang w:val="en-GB"/>
+        </w:rPr>
+        <w:t xml:space="preserve"> history of smart home automation truly began with the emergence of electricity in the late 19th century.[3]</w:t>
+      </w:r>
+    </w:p>
+    <w:p>
+      <w:pPr>
+        <w:pStyle w:val="Normal"/>
         <w:spacing w:before="240" w:beforeAutospacing="off" w:after="240" w:afterAutospacing="off"/>
         <w:jc w:val="left"/>
+        <w:rPr>
+          <w:rFonts w:ascii="Times New Roman" w:hAnsi="Times New Roman" w:eastAsia="Times New Roman" w:cs="Times New Roman"/>
+          <w:b w:val="0"/>
+          <w:bCs w:val="0"/>
+          <w:noProof w:val="0"/>
+          <w:sz w:val="24"/>
+          <w:szCs w:val="24"/>
+          <w:lang w:val="en-GB"/>
+        </w:rPr>
+      </w:pPr>
+      <w:r>
+        <w:rPr>
+          <w:rFonts w:ascii="Times New Roman" w:hAnsi="Times New Roman" w:eastAsia="Times New Roman" w:cs="Times New Roman"/>
+          <w:b w:val="0"/>
+          <w:bCs w:val="0"/>
+          <w:noProof w:val="0"/>
+          <w:sz w:val="24"/>
+          <w:szCs w:val="24"/>
+          <w:lang w:val="en-GB"/>
+        </w:rPr>
+        <w:t>A smart home is a home with devices that can be</w:t>
+      </w:r>
+      <w:r>
+        <w:rPr>
+          <w:rFonts w:ascii="Times New Roman" w:hAnsi="Times New Roman" w:eastAsia="Times New Roman" w:cs="Times New Roman"/>
+          <w:b w:val="0"/>
+          <w:bCs w:val="0"/>
+          <w:noProof w:val="0"/>
+          <w:sz w:val="24"/>
+          <w:szCs w:val="24"/>
+          <w:lang w:val="en-GB"/>
+        </w:rPr>
+        <w:t xml:space="preserve"> </w:t>
+      </w:r>
+      <w:r>
+        <w:rPr>
+          <w:rFonts w:ascii="Times New Roman" w:hAnsi="Times New Roman" w:eastAsia="Times New Roman" w:cs="Times New Roman"/>
+          <w:b w:val="0"/>
+          <w:bCs w:val="0"/>
+          <w:noProof w:val="0"/>
+          <w:sz w:val="24"/>
+          <w:szCs w:val="24"/>
+          <w:lang w:val="en-GB"/>
+        </w:rPr>
+        <w:t>managed</w:t>
+      </w:r>
+      <w:r>
+        <w:rPr>
+          <w:rFonts w:ascii="Times New Roman" w:hAnsi="Times New Roman" w:eastAsia="Times New Roman" w:cs="Times New Roman"/>
+          <w:b w:val="0"/>
+          <w:bCs w:val="0"/>
+          <w:noProof w:val="0"/>
+          <w:sz w:val="24"/>
+          <w:szCs w:val="24"/>
+          <w:lang w:val="en-GB"/>
+        </w:rPr>
+        <w:t xml:space="preserve"> </w:t>
+      </w:r>
+      <w:r>
+        <w:rPr>
+          <w:rFonts w:ascii="Times New Roman" w:hAnsi="Times New Roman" w:eastAsia="Times New Roman" w:cs="Times New Roman"/>
+          <w:b w:val="0"/>
+          <w:bCs w:val="0"/>
+          <w:noProof w:val="0"/>
+          <w:sz w:val="24"/>
+          <w:szCs w:val="24"/>
+          <w:lang w:val="en-GB"/>
+        </w:rPr>
+        <w:t>remotely using a smartphone or a computer</w:t>
+      </w:r>
+      <w:r>
+        <w:rPr>
+          <w:rFonts w:ascii="Times New Roman" w:hAnsi="Times New Roman" w:eastAsia="Times New Roman" w:cs="Times New Roman"/>
+          <w:b w:val="0"/>
+          <w:bCs w:val="0"/>
+          <w:noProof w:val="0"/>
+          <w:sz w:val="24"/>
+          <w:szCs w:val="24"/>
+          <w:lang w:val="en-GB"/>
+        </w:rPr>
+        <w:t xml:space="preserve"> to control </w:t>
+      </w:r>
+      <w:r>
+        <w:rPr>
+          <w:rFonts w:ascii="Times New Roman" w:hAnsi="Times New Roman" w:eastAsia="Times New Roman" w:cs="Times New Roman"/>
+          <w:b w:val="0"/>
+          <w:bCs w:val="0"/>
+          <w:noProof w:val="0"/>
+          <w:sz w:val="24"/>
+          <w:szCs w:val="24"/>
+          <w:lang w:val="en-GB"/>
+        </w:rPr>
+        <w:t>lighting, temperature</w:t>
+      </w:r>
+      <w:r>
+        <w:rPr>
+          <w:rFonts w:ascii="Times New Roman" w:hAnsi="Times New Roman" w:eastAsia="Times New Roman" w:cs="Times New Roman"/>
+          <w:b w:val="0"/>
+          <w:bCs w:val="0"/>
+          <w:noProof w:val="0"/>
+          <w:sz w:val="24"/>
+          <w:szCs w:val="24"/>
+          <w:lang w:val="en-GB"/>
+        </w:rPr>
+        <w:t xml:space="preserve">, </w:t>
+      </w:r>
+      <w:r>
+        <w:rPr>
+          <w:rFonts w:ascii="Times New Roman" w:hAnsi="Times New Roman" w:eastAsia="Times New Roman" w:cs="Times New Roman"/>
+          <w:b w:val="0"/>
+          <w:bCs w:val="0"/>
+          <w:noProof w:val="0"/>
+          <w:sz w:val="24"/>
+          <w:szCs w:val="24"/>
+          <w:lang w:val="en-GB"/>
+        </w:rPr>
+        <w:t>s</w:t>
+      </w:r>
+      <w:r>
+        <w:rPr>
+          <w:rFonts w:ascii="Times New Roman" w:hAnsi="Times New Roman" w:eastAsia="Times New Roman" w:cs="Times New Roman"/>
+          <w:b w:val="0"/>
+          <w:bCs w:val="0"/>
+          <w:noProof w:val="0"/>
+          <w:sz w:val="24"/>
+          <w:szCs w:val="24"/>
+          <w:lang w:val="en-GB"/>
+        </w:rPr>
+        <w:t>ecurity</w:t>
+      </w:r>
+      <w:r>
+        <w:rPr>
+          <w:rFonts w:ascii="Times New Roman" w:hAnsi="Times New Roman" w:eastAsia="Times New Roman" w:cs="Times New Roman"/>
+          <w:b w:val="0"/>
+          <w:bCs w:val="0"/>
+          <w:noProof w:val="0"/>
+          <w:sz w:val="24"/>
+          <w:szCs w:val="24"/>
+          <w:lang w:val="en-GB"/>
+        </w:rPr>
+        <w:t xml:space="preserve"> </w:t>
+      </w:r>
+      <w:r>
+        <w:rPr>
+          <w:rFonts w:ascii="Times New Roman" w:hAnsi="Times New Roman" w:eastAsia="Times New Roman" w:cs="Times New Roman"/>
+          <w:b w:val="0"/>
+          <w:bCs w:val="0"/>
+          <w:noProof w:val="0"/>
+          <w:sz w:val="24"/>
+          <w:szCs w:val="24"/>
+          <w:lang w:val="en-GB"/>
+        </w:rPr>
+        <w:t xml:space="preserve">and </w:t>
+      </w:r>
+      <w:r>
+        <w:rPr>
+          <w:rFonts w:ascii="Times New Roman" w:hAnsi="Times New Roman" w:eastAsia="Times New Roman" w:cs="Times New Roman"/>
+          <w:b w:val="0"/>
+          <w:bCs w:val="0"/>
+          <w:noProof w:val="0"/>
+          <w:sz w:val="24"/>
+          <w:szCs w:val="24"/>
+          <w:lang w:val="en-GB"/>
+        </w:rPr>
+        <w:t xml:space="preserve">various </w:t>
+      </w:r>
+      <w:r>
+        <w:rPr>
+          <w:rFonts w:ascii="Times New Roman" w:hAnsi="Times New Roman" w:eastAsia="Times New Roman" w:cs="Times New Roman"/>
+          <w:b w:val="0"/>
+          <w:bCs w:val="0"/>
+          <w:noProof w:val="0"/>
+          <w:sz w:val="24"/>
+          <w:szCs w:val="24"/>
+          <w:lang w:val="en-GB"/>
+        </w:rPr>
+        <w:t>other</w:t>
+      </w:r>
+      <w:r>
+        <w:rPr>
+          <w:rFonts w:ascii="Times New Roman" w:hAnsi="Times New Roman" w:eastAsia="Times New Roman" w:cs="Times New Roman"/>
+          <w:b w:val="0"/>
+          <w:bCs w:val="0"/>
+          <w:noProof w:val="0"/>
+          <w:sz w:val="24"/>
+          <w:szCs w:val="24"/>
+          <w:lang w:val="en-GB"/>
+        </w:rPr>
+        <w:t xml:space="preserve"> </w:t>
+      </w:r>
+      <w:r>
+        <w:rPr>
+          <w:rFonts w:ascii="Times New Roman" w:hAnsi="Times New Roman" w:eastAsia="Times New Roman" w:cs="Times New Roman"/>
+          <w:b w:val="0"/>
+          <w:bCs w:val="0"/>
+          <w:noProof w:val="0"/>
+          <w:sz w:val="24"/>
+          <w:szCs w:val="24"/>
+          <w:lang w:val="en-GB"/>
+        </w:rPr>
+        <w:t>functions</w:t>
+      </w:r>
+      <w:r>
+        <w:rPr>
+          <w:rFonts w:ascii="Times New Roman" w:hAnsi="Times New Roman" w:eastAsia="Times New Roman" w:cs="Times New Roman"/>
+          <w:b w:val="0"/>
+          <w:bCs w:val="0"/>
+          <w:noProof w:val="0"/>
+          <w:sz w:val="24"/>
+          <w:szCs w:val="24"/>
+          <w:lang w:val="en-GB"/>
+        </w:rPr>
+        <w:t>.</w:t>
+      </w:r>
+      <w:r>
+        <w:rPr>
+          <w:rFonts w:ascii="Times New Roman" w:hAnsi="Times New Roman" w:eastAsia="Times New Roman" w:cs="Times New Roman"/>
+          <w:b w:val="0"/>
+          <w:bCs w:val="0"/>
+          <w:noProof w:val="0"/>
+          <w:sz w:val="24"/>
+          <w:szCs w:val="24"/>
+          <w:lang w:val="en-GB"/>
+        </w:rPr>
+        <w:t xml:space="preserve"> </w:t>
+      </w:r>
+      <w:r>
+        <w:rPr>
+          <w:rFonts w:ascii="Times New Roman" w:hAnsi="Times New Roman" w:eastAsia="Times New Roman" w:cs="Times New Roman"/>
+          <w:b w:val="0"/>
+          <w:bCs w:val="0"/>
+          <w:noProof w:val="0"/>
+          <w:sz w:val="24"/>
+          <w:szCs w:val="24"/>
+          <w:lang w:val="en-GB"/>
+        </w:rPr>
+        <w:t xml:space="preserve">Smart </w:t>
+      </w:r>
+      <w:r>
+        <w:rPr>
+          <w:rFonts w:ascii="Times New Roman" w:hAnsi="Times New Roman" w:eastAsia="Times New Roman" w:cs="Times New Roman"/>
+          <w:b w:val="0"/>
+          <w:bCs w:val="0"/>
+          <w:noProof w:val="0"/>
+          <w:sz w:val="24"/>
+          <w:szCs w:val="24"/>
+          <w:lang w:val="en-GB"/>
+        </w:rPr>
+        <w:t>homes</w:t>
+      </w:r>
+      <w:r>
+        <w:rPr>
+          <w:rFonts w:ascii="Times New Roman" w:hAnsi="Times New Roman" w:eastAsia="Times New Roman" w:cs="Times New Roman"/>
+          <w:b w:val="0"/>
+          <w:bCs w:val="0"/>
+          <w:noProof w:val="0"/>
+          <w:sz w:val="24"/>
+          <w:szCs w:val="24"/>
+          <w:lang w:val="en-GB"/>
+        </w:rPr>
+        <w:t xml:space="preserve"> </w:t>
+      </w:r>
+      <w:r>
+        <w:rPr>
+          <w:rFonts w:ascii="Times New Roman" w:hAnsi="Times New Roman" w:eastAsia="Times New Roman" w:cs="Times New Roman"/>
+          <w:b w:val="0"/>
+          <w:bCs w:val="0"/>
+          <w:noProof w:val="0"/>
+          <w:sz w:val="24"/>
+          <w:szCs w:val="24"/>
+          <w:lang w:val="en-GB"/>
+        </w:rPr>
+        <w:t>offer</w:t>
+      </w:r>
+      <w:r>
+        <w:rPr>
+          <w:rFonts w:ascii="Times New Roman" w:hAnsi="Times New Roman" w:eastAsia="Times New Roman" w:cs="Times New Roman"/>
+          <w:b w:val="0"/>
+          <w:bCs w:val="0"/>
+          <w:noProof w:val="0"/>
+          <w:sz w:val="24"/>
+          <w:szCs w:val="24"/>
+          <w:lang w:val="en-GB"/>
+        </w:rPr>
+        <w:t xml:space="preserve"> m</w:t>
+      </w:r>
+      <w:r>
+        <w:rPr>
+          <w:rFonts w:ascii="Times New Roman" w:hAnsi="Times New Roman" w:eastAsia="Times New Roman" w:cs="Times New Roman"/>
+          <w:b w:val="0"/>
+          <w:bCs w:val="0"/>
+          <w:noProof w:val="0"/>
+          <w:sz w:val="24"/>
+          <w:szCs w:val="24"/>
+          <w:lang w:val="en-GB"/>
+        </w:rPr>
+        <w:t>ultiple be</w:t>
+      </w:r>
+      <w:r>
+        <w:rPr>
+          <w:rFonts w:ascii="Times New Roman" w:hAnsi="Times New Roman" w:eastAsia="Times New Roman" w:cs="Times New Roman"/>
+          <w:b w:val="0"/>
+          <w:bCs w:val="0"/>
+          <w:noProof w:val="0"/>
+          <w:sz w:val="24"/>
+          <w:szCs w:val="24"/>
+          <w:lang w:val="en-GB"/>
+        </w:rPr>
+        <w:t>nefits</w:t>
+      </w:r>
+      <w:r>
+        <w:rPr>
+          <w:rFonts w:ascii="Times New Roman" w:hAnsi="Times New Roman" w:eastAsia="Times New Roman" w:cs="Times New Roman"/>
+          <w:b w:val="0"/>
+          <w:bCs w:val="0"/>
+          <w:noProof w:val="0"/>
+          <w:sz w:val="24"/>
+          <w:szCs w:val="24"/>
+          <w:lang w:val="en-GB"/>
+        </w:rPr>
+        <w:t xml:space="preserve"> including</w:t>
+      </w:r>
+      <w:r>
+        <w:rPr>
+          <w:rFonts w:ascii="Times New Roman" w:hAnsi="Times New Roman" w:eastAsia="Times New Roman" w:cs="Times New Roman"/>
+          <w:b w:val="0"/>
+          <w:bCs w:val="0"/>
+          <w:noProof w:val="0"/>
+          <w:sz w:val="24"/>
+          <w:szCs w:val="24"/>
+          <w:lang w:val="en-GB"/>
+        </w:rPr>
+        <w:t xml:space="preserve"> </w:t>
+      </w:r>
+      <w:r>
+        <w:rPr>
+          <w:rFonts w:ascii="Times New Roman" w:hAnsi="Times New Roman" w:eastAsia="Times New Roman" w:cs="Times New Roman"/>
+          <w:b w:val="0"/>
+          <w:bCs w:val="0"/>
+          <w:noProof w:val="0"/>
+          <w:sz w:val="24"/>
+          <w:szCs w:val="24"/>
+          <w:lang w:val="en-GB"/>
+        </w:rPr>
+        <w:t>improved</w:t>
+      </w:r>
+      <w:r>
+        <w:rPr>
+          <w:rFonts w:ascii="Times New Roman" w:hAnsi="Times New Roman" w:eastAsia="Times New Roman" w:cs="Times New Roman"/>
+          <w:b w:val="0"/>
+          <w:bCs w:val="0"/>
+          <w:noProof w:val="0"/>
+          <w:sz w:val="24"/>
+          <w:szCs w:val="24"/>
+          <w:lang w:val="en-GB"/>
+        </w:rPr>
+        <w:t xml:space="preserve"> </w:t>
+      </w:r>
+      <w:r>
+        <w:rPr>
+          <w:rFonts w:ascii="Times New Roman" w:hAnsi="Times New Roman" w:eastAsia="Times New Roman" w:cs="Times New Roman"/>
+          <w:b w:val="0"/>
+          <w:bCs w:val="0"/>
+          <w:noProof w:val="0"/>
+          <w:sz w:val="24"/>
+          <w:szCs w:val="24"/>
+          <w:lang w:val="en-GB"/>
+        </w:rPr>
+        <w:t>energy efficiency</w:t>
+      </w:r>
+      <w:r>
+        <w:rPr>
+          <w:rFonts w:ascii="Times New Roman" w:hAnsi="Times New Roman" w:eastAsia="Times New Roman" w:cs="Times New Roman"/>
+          <w:b w:val="0"/>
+          <w:bCs w:val="0"/>
+          <w:noProof w:val="0"/>
+          <w:sz w:val="24"/>
+          <w:szCs w:val="24"/>
+          <w:lang w:val="en-GB"/>
+        </w:rPr>
+        <w:t xml:space="preserve"> </w:t>
+      </w:r>
+      <w:r>
+        <w:rPr>
+          <w:rFonts w:ascii="Times New Roman" w:hAnsi="Times New Roman" w:eastAsia="Times New Roman" w:cs="Times New Roman"/>
+          <w:b w:val="0"/>
+          <w:bCs w:val="0"/>
+          <w:noProof w:val="0"/>
+          <w:sz w:val="24"/>
+          <w:szCs w:val="24"/>
+          <w:lang w:val="en-GB"/>
+        </w:rPr>
+        <w:t xml:space="preserve">and enhanced </w:t>
+      </w:r>
+      <w:r>
+        <w:rPr>
+          <w:rFonts w:ascii="Times New Roman" w:hAnsi="Times New Roman" w:eastAsia="Times New Roman" w:cs="Times New Roman"/>
+          <w:b w:val="0"/>
+          <w:bCs w:val="0"/>
+          <w:noProof w:val="0"/>
+          <w:sz w:val="24"/>
+          <w:szCs w:val="24"/>
+          <w:lang w:val="en-GB"/>
+        </w:rPr>
+        <w:t>protection</w:t>
+      </w:r>
+      <w:r>
+        <w:rPr>
+          <w:rFonts w:ascii="Times New Roman" w:hAnsi="Times New Roman" w:eastAsia="Times New Roman" w:cs="Times New Roman"/>
+          <w:b w:val="0"/>
+          <w:bCs w:val="0"/>
+          <w:noProof w:val="0"/>
+          <w:sz w:val="24"/>
+          <w:szCs w:val="24"/>
+          <w:lang w:val="en-GB"/>
+        </w:rPr>
+        <w:t xml:space="preserve"> </w:t>
+      </w:r>
+      <w:r>
+        <w:rPr>
+          <w:rFonts w:ascii="Times New Roman" w:hAnsi="Times New Roman" w:eastAsia="Times New Roman" w:cs="Times New Roman"/>
+          <w:b w:val="0"/>
+          <w:bCs w:val="0"/>
+          <w:noProof w:val="0"/>
+          <w:sz w:val="24"/>
+          <w:szCs w:val="24"/>
+          <w:lang w:val="en-GB"/>
+        </w:rPr>
+        <w:t>for residents</w:t>
+      </w:r>
+      <w:r>
+        <w:rPr>
+          <w:rFonts w:ascii="Times New Roman" w:hAnsi="Times New Roman" w:eastAsia="Times New Roman" w:cs="Times New Roman"/>
+          <w:b w:val="0"/>
+          <w:bCs w:val="0"/>
+          <w:noProof w:val="0"/>
+          <w:sz w:val="24"/>
+          <w:szCs w:val="24"/>
+          <w:lang w:val="en-GB"/>
+        </w:rPr>
+        <w:t>.</w:t>
+      </w:r>
+      <w:r>
+        <w:rPr>
+          <w:rFonts w:ascii="Times New Roman" w:hAnsi="Times New Roman" w:eastAsia="Times New Roman" w:cs="Times New Roman"/>
+          <w:b w:val="0"/>
+          <w:bCs w:val="0"/>
+          <w:noProof w:val="0"/>
+          <w:sz w:val="24"/>
+          <w:szCs w:val="24"/>
+          <w:lang w:val="en-GB"/>
+        </w:rPr>
+        <w:t>[1]</w:t>
+      </w:r>
+    </w:p>
+    <w:p>
+      <w:pPr>
+        <w:pStyle w:val="Normal"/>
+        <w:spacing w:before="240" w:beforeAutospacing="off" w:after="240" w:afterAutospacing="off"/>
+        <w:jc w:val="left"/>
+        <w:rPr>
+          <w:rFonts w:ascii="Times New Roman" w:hAnsi="Times New Roman" w:eastAsia="Times New Roman" w:cs="Times New Roman"/>
+          <w:noProof w:val="0"/>
+          <w:sz w:val="24"/>
+          <w:szCs w:val="24"/>
+          <w:lang w:val="en-GB"/>
+        </w:rPr>
+      </w:pPr>
+      <w:r>
+        <w:rPr>
+          <w:rFonts w:ascii="Times New Roman" w:hAnsi="Times New Roman" w:eastAsia="Times New Roman" w:cs="Times New Roman"/>
+          <w:noProof w:val="0"/>
+          <w:sz w:val="24"/>
+          <w:szCs w:val="24"/>
+          <w:lang w:val="en-GB"/>
+        </w:rPr>
+        <w:t>According to Precedence Research, t</w:t>
+      </w:r>
+      <w:r>
+        <w:rPr>
+          <w:rFonts w:ascii="Times New Roman" w:hAnsi="Times New Roman" w:eastAsia="Times New Roman" w:cs="Times New Roman"/>
+          <w:b w:val="0"/>
+          <w:bCs w:val="0"/>
+          <w:noProof w:val="0"/>
+          <w:sz w:val="24"/>
+          <w:szCs w:val="24"/>
+          <w:lang w:val="en-GB"/>
+        </w:rPr>
+        <w:t xml:space="preserve">he global smart home </w:t>
+      </w:r>
+      <w:r>
+        <w:rPr>
+          <w:rFonts w:ascii="Times New Roman" w:hAnsi="Times New Roman" w:eastAsia="Times New Roman" w:cs="Times New Roman"/>
+          <w:b w:val="0"/>
+          <w:bCs w:val="0"/>
+          <w:noProof w:val="0"/>
+          <w:sz w:val="24"/>
+          <w:szCs w:val="24"/>
+          <w:lang w:val="en-GB"/>
+        </w:rPr>
+        <w:t>market size was</w:t>
+      </w:r>
+      <w:r>
+        <w:rPr>
+          <w:rFonts w:ascii="Times New Roman" w:hAnsi="Times New Roman" w:eastAsia="Times New Roman" w:cs="Times New Roman"/>
+          <w:b w:val="0"/>
+          <w:bCs w:val="0"/>
+          <w:noProof w:val="0"/>
+          <w:sz w:val="24"/>
+          <w:szCs w:val="24"/>
+          <w:lang w:val="en-GB"/>
+        </w:rPr>
+        <w:t xml:space="preserve"> </w:t>
+      </w:r>
+      <w:r>
+        <w:rPr>
+          <w:rFonts w:ascii="Times New Roman" w:hAnsi="Times New Roman" w:eastAsia="Times New Roman" w:cs="Times New Roman"/>
+          <w:b w:val="0"/>
+          <w:bCs w:val="0"/>
+          <w:noProof w:val="0"/>
+          <w:sz w:val="24"/>
+          <w:szCs w:val="24"/>
+          <w:lang w:val="en-GB"/>
+        </w:rPr>
+        <w:t xml:space="preserve">valued at approximately </w:t>
+      </w:r>
+      <w:r>
+        <w:rPr>
+          <w:rFonts w:ascii="Times New Roman" w:hAnsi="Times New Roman" w:eastAsia="Times New Roman" w:cs="Times New Roman"/>
+          <w:b w:val="0"/>
+          <w:bCs w:val="0"/>
+          <w:noProof w:val="0"/>
+          <w:sz w:val="24"/>
+          <w:szCs w:val="24"/>
+          <w:lang w:val="en-GB"/>
+        </w:rPr>
+        <w:t>USD 127.67 billion in 202</w:t>
+      </w:r>
+      <w:r>
+        <w:rPr>
+          <w:rFonts w:ascii="Times New Roman" w:hAnsi="Times New Roman" w:eastAsia="Times New Roman" w:cs="Times New Roman"/>
+          <w:b w:val="0"/>
+          <w:bCs w:val="0"/>
+          <w:noProof w:val="0"/>
+          <w:sz w:val="24"/>
+          <w:szCs w:val="24"/>
+          <w:lang w:val="en-GB"/>
+        </w:rPr>
+        <w:t xml:space="preserve">4 and is </w:t>
+      </w:r>
+      <w:r>
+        <w:rPr>
+          <w:rFonts w:ascii="Times New Roman" w:hAnsi="Times New Roman" w:eastAsia="Times New Roman" w:cs="Times New Roman"/>
+          <w:noProof w:val="0"/>
+          <w:sz w:val="24"/>
+          <w:szCs w:val="24"/>
+          <w:lang w:val="en-GB"/>
+        </w:rPr>
+        <w:t>projected to surpass</w:t>
+      </w:r>
+      <w:r>
+        <w:rPr>
+          <w:rFonts w:ascii="Times New Roman" w:hAnsi="Times New Roman" w:eastAsia="Times New Roman" w:cs="Times New Roman"/>
+          <w:b w:val="0"/>
+          <w:bCs w:val="0"/>
+          <w:noProof w:val="0"/>
+          <w:sz w:val="24"/>
+          <w:szCs w:val="24"/>
+          <w:lang w:val="en-GB"/>
+        </w:rPr>
+        <w:t xml:space="preserve"> USD 1</w:t>
+      </w:r>
+      <w:r>
+        <w:rPr>
+          <w:rFonts w:ascii="Times New Roman" w:hAnsi="Times New Roman" w:eastAsia="Times New Roman" w:cs="Times New Roman"/>
+          <w:b w:val="0"/>
+          <w:bCs w:val="0"/>
+          <w:noProof w:val="0"/>
+          <w:sz w:val="24"/>
+          <w:szCs w:val="24"/>
+          <w:lang w:val="en-GB"/>
+        </w:rPr>
+        <w:t>,</w:t>
+      </w:r>
+      <w:r>
+        <w:rPr>
+          <w:rFonts w:ascii="Times New Roman" w:hAnsi="Times New Roman" w:eastAsia="Times New Roman" w:cs="Times New Roman"/>
+          <w:b w:val="0"/>
+          <w:bCs w:val="0"/>
+          <w:noProof w:val="0"/>
+          <w:sz w:val="24"/>
+          <w:szCs w:val="24"/>
+          <w:lang w:val="en-GB"/>
+        </w:rPr>
+        <w:t>4</w:t>
+      </w:r>
+      <w:r>
+        <w:rPr>
+          <w:rFonts w:ascii="Times New Roman" w:hAnsi="Times New Roman" w:eastAsia="Times New Roman" w:cs="Times New Roman"/>
+          <w:b w:val="0"/>
+          <w:bCs w:val="0"/>
+          <w:noProof w:val="0"/>
+          <w:sz w:val="24"/>
+          <w:szCs w:val="24"/>
+          <w:lang w:val="en-GB"/>
+        </w:rPr>
+        <w:t>04.59 billion by 2034, growing at a</w:t>
+      </w:r>
+      <w:r>
+        <w:rPr>
+          <w:rFonts w:ascii="Times New Roman" w:hAnsi="Times New Roman" w:eastAsia="Times New Roman" w:cs="Times New Roman"/>
+          <w:b w:val="0"/>
+          <w:bCs w:val="0"/>
+          <w:noProof w:val="0"/>
+          <w:sz w:val="24"/>
+          <w:szCs w:val="24"/>
+          <w:lang w:val="en-GB"/>
+        </w:rPr>
+        <w:t>n average rate of 27.10% from 2025 t</w:t>
+      </w:r>
+      <w:r>
+        <w:rPr>
+          <w:rFonts w:ascii="Times New Roman" w:hAnsi="Times New Roman" w:eastAsia="Times New Roman" w:cs="Times New Roman"/>
+          <w:b w:val="0"/>
+          <w:bCs w:val="0"/>
+          <w:noProof w:val="0"/>
+          <w:sz w:val="24"/>
+          <w:szCs w:val="24"/>
+          <w:lang w:val="en-GB"/>
+        </w:rPr>
+        <w:t>o 2034.</w:t>
+      </w:r>
+      <w:r>
+        <w:rPr>
+          <w:rFonts w:ascii="Times New Roman" w:hAnsi="Times New Roman" w:eastAsia="Times New Roman" w:cs="Times New Roman"/>
+          <w:b w:val="0"/>
+          <w:bCs w:val="0"/>
+          <w:noProof w:val="0"/>
+          <w:sz w:val="24"/>
+          <w:szCs w:val="24"/>
+          <w:lang w:val="en-GB"/>
+        </w:rPr>
+        <w:t>[</w:t>
+      </w:r>
+      <w:r>
+        <w:rPr>
+          <w:rFonts w:ascii="Times New Roman" w:hAnsi="Times New Roman" w:eastAsia="Times New Roman" w:cs="Times New Roman"/>
+          <w:b w:val="0"/>
+          <w:bCs w:val="0"/>
+          <w:noProof w:val="0"/>
+          <w:sz w:val="24"/>
+          <w:szCs w:val="24"/>
+          <w:lang w:val="en-GB"/>
+        </w:rPr>
+        <w:t>2</w:t>
+      </w:r>
+      <w:r>
+        <w:rPr>
+          <w:rFonts w:ascii="Times New Roman" w:hAnsi="Times New Roman" w:eastAsia="Times New Roman" w:cs="Times New Roman"/>
+          <w:b w:val="0"/>
+          <w:bCs w:val="0"/>
+          <w:noProof w:val="0"/>
+          <w:sz w:val="24"/>
+          <w:szCs w:val="24"/>
+          <w:lang w:val="en-GB"/>
+        </w:rPr>
+        <w:t>]</w:t>
+      </w:r>
+      <w:r>
+        <w:rPr>
+          <w:rFonts w:ascii="Times New Roman" w:hAnsi="Times New Roman" w:eastAsia="Times New Roman" w:cs="Times New Roman"/>
+          <w:b w:val="0"/>
+          <w:bCs w:val="0"/>
+          <w:noProof w:val="0"/>
+          <w:sz w:val="24"/>
+          <w:szCs w:val="24"/>
+          <w:lang w:val="en-GB"/>
+        </w:rPr>
+        <w:t xml:space="preserve"> </w:t>
+      </w:r>
+      <w:r>
+        <w:rPr>
+          <w:rFonts w:ascii="Times New Roman" w:hAnsi="Times New Roman" w:eastAsia="Times New Roman" w:cs="Times New Roman"/>
+          <w:noProof w:val="0"/>
+          <w:sz w:val="24"/>
+          <w:szCs w:val="24"/>
+          <w:lang w:val="en-GB"/>
+        </w:rPr>
+        <w:t>A</w:t>
+      </w:r>
+      <w:r>
+        <w:rPr>
+          <w:rFonts w:ascii="Times New Roman" w:hAnsi="Times New Roman" w:eastAsia="Times New Roman" w:cs="Times New Roman"/>
+          <w:noProof w:val="0"/>
+          <w:sz w:val="24"/>
+          <w:szCs w:val="24"/>
+          <w:lang w:val="en-GB"/>
+        </w:rPr>
+        <w:t xml:space="preserve">ccording to Fortune Business Insights the global smart home market size was valued at approximately USD 147.52 billion in 2025 and is projected to </w:t>
+      </w:r>
+      <w:r>
+        <w:rPr>
+          <w:rFonts w:ascii="Times New Roman" w:hAnsi="Times New Roman" w:eastAsia="Times New Roman" w:cs="Times New Roman"/>
+          <w:noProof w:val="0"/>
+          <w:sz w:val="24"/>
+          <w:szCs w:val="24"/>
+          <w:lang w:val="en-GB"/>
+        </w:rPr>
+        <w:t>grow</w:t>
+      </w:r>
+      <w:r>
+        <w:rPr>
+          <w:rFonts w:ascii="Times New Roman" w:hAnsi="Times New Roman" w:eastAsia="Times New Roman" w:cs="Times New Roman"/>
+          <w:noProof w:val="0"/>
+          <w:sz w:val="24"/>
+          <w:szCs w:val="24"/>
+          <w:lang w:val="en-GB"/>
+        </w:rPr>
+        <w:t xml:space="preserve"> from USD 180.12 billion in 2026 to USD 848.47 billion by 2034, </w:t>
+      </w:r>
+      <w:r>
+        <w:rPr>
+          <w:rFonts w:ascii="Times New Roman" w:hAnsi="Times New Roman" w:eastAsia="Times New Roman" w:cs="Times New Roman"/>
+          <w:noProof w:val="0"/>
+          <w:sz w:val="24"/>
+          <w:szCs w:val="24"/>
+          <w:lang w:val="en-GB"/>
+        </w:rPr>
+        <w:t>showcasing</w:t>
+      </w:r>
+      <w:r>
+        <w:rPr>
+          <w:rFonts w:ascii="Times New Roman" w:hAnsi="Times New Roman" w:eastAsia="Times New Roman" w:cs="Times New Roman"/>
+          <w:noProof w:val="0"/>
+          <w:sz w:val="24"/>
+          <w:szCs w:val="24"/>
+          <w:lang w:val="en-GB"/>
+        </w:rPr>
+        <w:t xml:space="preserve"> an average rate of 21.40% during the forecast period.[1]</w:t>
+      </w:r>
+    </w:p>
+    <w:p>
+      <w:pPr>
+        <w:pStyle w:val="Normal"/>
+        <w:spacing w:before="240" w:beforeAutospacing="off" w:after="240" w:afterAutospacing="off"/>
+        <w:jc w:val="left"/>
+        <w:rPr>
+          <w:rFonts w:ascii="Times New Roman" w:hAnsi="Times New Roman" w:eastAsia="Times New Roman" w:cs="Times New Roman"/>
+          <w:noProof w:val="0"/>
+          <w:sz w:val="24"/>
+          <w:szCs w:val="24"/>
+          <w:lang w:val="en-GB"/>
+        </w:rPr>
+      </w:pPr>
+      <w:r>
+        <w:rPr>
+          <w:rFonts w:ascii="Times New Roman" w:hAnsi="Times New Roman" w:eastAsia="Times New Roman" w:cs="Times New Roman"/>
+          <w:b w:val="0"/>
+          <w:bCs w:val="0"/>
+          <w:noProof w:val="0"/>
+          <w:sz w:val="24"/>
+          <w:szCs w:val="24"/>
+          <w:lang w:val="en-GB"/>
+        </w:rPr>
+        <w:t xml:space="preserve">The </w:t>
+      </w:r>
+      <w:r>
+        <w:rPr>
+          <w:rFonts w:ascii="Times New Roman" w:hAnsi="Times New Roman" w:eastAsia="Times New Roman" w:cs="Times New Roman"/>
+          <w:b w:val="0"/>
+          <w:bCs w:val="0"/>
+          <w:noProof w:val="0"/>
+          <w:sz w:val="24"/>
+          <w:szCs w:val="24"/>
+          <w:lang w:val="en-GB"/>
+        </w:rPr>
+        <w:t>deployment</w:t>
+      </w:r>
+      <w:r>
+        <w:rPr>
+          <w:rFonts w:ascii="Times New Roman" w:hAnsi="Times New Roman" w:eastAsia="Times New Roman" w:cs="Times New Roman"/>
+          <w:b w:val="0"/>
+          <w:bCs w:val="0"/>
+          <w:noProof w:val="0"/>
+          <w:sz w:val="24"/>
+          <w:szCs w:val="24"/>
+          <w:lang w:val="en-GB"/>
+        </w:rPr>
+        <w:t xml:space="preserve"> of advanced technology, manufacturing </w:t>
+      </w:r>
+      <w:r>
+        <w:rPr>
+          <w:rFonts w:ascii="Times New Roman" w:hAnsi="Times New Roman" w:eastAsia="Times New Roman" w:cs="Times New Roman"/>
+          <w:b w:val="0"/>
+          <w:bCs w:val="0"/>
+          <w:noProof w:val="0"/>
+          <w:sz w:val="24"/>
+          <w:szCs w:val="24"/>
+          <w:lang w:val="en-GB"/>
+        </w:rPr>
+        <w:t>and the</w:t>
+      </w:r>
+      <w:r>
+        <w:rPr>
+          <w:rFonts w:ascii="Times New Roman" w:hAnsi="Times New Roman" w:eastAsia="Times New Roman" w:cs="Times New Roman"/>
+          <w:b w:val="0"/>
+          <w:bCs w:val="0"/>
+          <w:noProof w:val="0"/>
+          <w:sz w:val="24"/>
+          <w:szCs w:val="24"/>
+          <w:lang w:val="en-GB"/>
+        </w:rPr>
+        <w:t xml:space="preserve"> </w:t>
+      </w:r>
+      <w:r>
+        <w:rPr>
+          <w:rFonts w:ascii="Times New Roman" w:hAnsi="Times New Roman" w:eastAsia="Times New Roman" w:cs="Times New Roman"/>
+          <w:b w:val="0"/>
+          <w:bCs w:val="0"/>
+          <w:noProof w:val="0"/>
+          <w:sz w:val="24"/>
+          <w:szCs w:val="24"/>
+          <w:lang w:val="en-GB"/>
+        </w:rPr>
+        <w:t xml:space="preserve">installation cost of smart home devices </w:t>
+      </w:r>
+      <w:r>
+        <w:rPr>
+          <w:rFonts w:ascii="Times New Roman" w:hAnsi="Times New Roman" w:eastAsia="Times New Roman" w:cs="Times New Roman"/>
+          <w:b w:val="0"/>
+          <w:bCs w:val="0"/>
+          <w:noProof w:val="0"/>
+          <w:sz w:val="24"/>
+          <w:szCs w:val="24"/>
+          <w:lang w:val="en-GB"/>
+        </w:rPr>
+        <w:t>altogether</w:t>
+      </w:r>
+      <w:r>
+        <w:rPr>
+          <w:rFonts w:ascii="Times New Roman" w:hAnsi="Times New Roman" w:eastAsia="Times New Roman" w:cs="Times New Roman"/>
+          <w:b w:val="0"/>
+          <w:bCs w:val="0"/>
+          <w:noProof w:val="0"/>
+          <w:sz w:val="24"/>
+          <w:szCs w:val="24"/>
+          <w:lang w:val="en-GB"/>
+        </w:rPr>
+        <w:t xml:space="preserve"> </w:t>
+      </w:r>
+      <w:r>
+        <w:rPr>
+          <w:rFonts w:ascii="Times New Roman" w:hAnsi="Times New Roman" w:eastAsia="Times New Roman" w:cs="Times New Roman"/>
+          <w:b w:val="0"/>
+          <w:bCs w:val="0"/>
+          <w:noProof w:val="0"/>
+          <w:sz w:val="24"/>
+          <w:szCs w:val="24"/>
+          <w:lang w:val="en-GB"/>
+        </w:rPr>
+        <w:t>make</w:t>
+      </w:r>
+      <w:r>
+        <w:rPr>
+          <w:rFonts w:ascii="Times New Roman" w:hAnsi="Times New Roman" w:eastAsia="Times New Roman" w:cs="Times New Roman"/>
+          <w:b w:val="0"/>
+          <w:bCs w:val="0"/>
+          <w:noProof w:val="0"/>
+          <w:sz w:val="24"/>
+          <w:szCs w:val="24"/>
+          <w:lang w:val="en-GB"/>
+        </w:rPr>
+        <w:t xml:space="preserve"> it expensive.</w:t>
+      </w:r>
+      <w:r>
+        <w:rPr>
+          <w:rFonts w:ascii="Times New Roman" w:hAnsi="Times New Roman" w:eastAsia="Times New Roman" w:cs="Times New Roman"/>
+          <w:b w:val="0"/>
+          <w:bCs w:val="0"/>
+          <w:noProof w:val="0"/>
+          <w:sz w:val="24"/>
+          <w:szCs w:val="24"/>
+          <w:lang w:val="en-GB"/>
+        </w:rPr>
+        <w:t xml:space="preserve"> </w:t>
+      </w:r>
+      <w:r>
+        <w:rPr>
+          <w:rFonts w:ascii="Times New Roman" w:hAnsi="Times New Roman" w:eastAsia="Times New Roman" w:cs="Times New Roman"/>
+          <w:b w:val="0"/>
+          <w:bCs w:val="0"/>
+          <w:noProof w:val="0"/>
+          <w:sz w:val="24"/>
+          <w:szCs w:val="24"/>
+          <w:lang w:val="en-GB"/>
+        </w:rPr>
+        <w:t xml:space="preserve">Furthermore, </w:t>
+      </w:r>
+      <w:r>
+        <w:rPr>
+          <w:rFonts w:ascii="Times New Roman" w:hAnsi="Times New Roman" w:eastAsia="Times New Roman" w:cs="Times New Roman"/>
+          <w:b w:val="0"/>
+          <w:bCs w:val="0"/>
+          <w:noProof w:val="0"/>
+          <w:sz w:val="24"/>
+          <w:szCs w:val="24"/>
+          <w:lang w:val="en-GB"/>
+        </w:rPr>
+        <w:t>additional</w:t>
+      </w:r>
+      <w:r>
+        <w:rPr>
+          <w:rFonts w:ascii="Times New Roman" w:hAnsi="Times New Roman" w:eastAsia="Times New Roman" w:cs="Times New Roman"/>
+          <w:b w:val="0"/>
+          <w:bCs w:val="0"/>
+          <w:noProof w:val="0"/>
+          <w:sz w:val="24"/>
+          <w:szCs w:val="24"/>
+          <w:lang w:val="en-GB"/>
+        </w:rPr>
+        <w:t xml:space="preserve"> routine </w:t>
+      </w:r>
+      <w:r>
+        <w:rPr>
+          <w:rFonts w:ascii="Times New Roman" w:hAnsi="Times New Roman" w:eastAsia="Times New Roman" w:cs="Times New Roman"/>
+          <w:b w:val="0"/>
+          <w:bCs w:val="0"/>
+          <w:noProof w:val="0"/>
+          <w:sz w:val="24"/>
+          <w:szCs w:val="24"/>
+          <w:lang w:val="en-GB"/>
+        </w:rPr>
+        <w:t>maintenance</w:t>
+      </w:r>
+      <w:r>
+        <w:rPr>
+          <w:rFonts w:ascii="Times New Roman" w:hAnsi="Times New Roman" w:eastAsia="Times New Roman" w:cs="Times New Roman"/>
+          <w:b w:val="0"/>
+          <w:bCs w:val="0"/>
+          <w:noProof w:val="0"/>
+          <w:sz w:val="24"/>
+          <w:szCs w:val="24"/>
+          <w:lang w:val="en-GB"/>
+        </w:rPr>
+        <w:t xml:space="preserve"> and servicing cost</w:t>
+      </w:r>
+      <w:r>
+        <w:rPr>
+          <w:rFonts w:ascii="Times New Roman" w:hAnsi="Times New Roman" w:eastAsia="Times New Roman" w:cs="Times New Roman"/>
+          <w:b w:val="0"/>
+          <w:bCs w:val="0"/>
+          <w:noProof w:val="0"/>
+          <w:sz w:val="24"/>
+          <w:szCs w:val="24"/>
+          <w:lang w:val="en-GB"/>
+        </w:rPr>
+        <w:t>s</w:t>
+      </w:r>
+      <w:r>
+        <w:rPr>
+          <w:rFonts w:ascii="Times New Roman" w:hAnsi="Times New Roman" w:eastAsia="Times New Roman" w:cs="Times New Roman"/>
+          <w:b w:val="0"/>
+          <w:bCs w:val="0"/>
+          <w:noProof w:val="0"/>
+          <w:sz w:val="24"/>
+          <w:szCs w:val="24"/>
+          <w:lang w:val="en-GB"/>
+        </w:rPr>
+        <w:t xml:space="preserve"> limit</w:t>
+      </w:r>
+      <w:r>
+        <w:rPr>
+          <w:rFonts w:ascii="Times New Roman" w:hAnsi="Times New Roman" w:eastAsia="Times New Roman" w:cs="Times New Roman"/>
+          <w:b w:val="0"/>
+          <w:bCs w:val="0"/>
+          <w:noProof w:val="0"/>
+          <w:sz w:val="24"/>
+          <w:szCs w:val="24"/>
+          <w:lang w:val="en-GB"/>
+        </w:rPr>
+        <w:t xml:space="preserve"> the purchasing capacity for many people.</w:t>
+      </w:r>
+      <w:r>
+        <w:rPr>
+          <w:rFonts w:ascii="Times New Roman" w:hAnsi="Times New Roman" w:eastAsia="Times New Roman" w:cs="Times New Roman"/>
+          <w:b w:val="0"/>
+          <w:bCs w:val="0"/>
+          <w:noProof w:val="0"/>
+          <w:sz w:val="24"/>
+          <w:szCs w:val="24"/>
+          <w:lang w:val="en-GB"/>
+        </w:rPr>
+        <w:t xml:space="preserve"> </w:t>
+      </w:r>
+      <w:r>
+        <w:rPr>
+          <w:rFonts w:ascii="Times New Roman" w:hAnsi="Times New Roman" w:eastAsia="Times New Roman" w:cs="Times New Roman"/>
+          <w:b w:val="0"/>
+          <w:bCs w:val="0"/>
+          <w:noProof w:val="0"/>
+          <w:sz w:val="24"/>
+          <w:szCs w:val="24"/>
+          <w:lang w:val="en-GB"/>
+        </w:rPr>
+        <w:t>Therefore,</w:t>
+      </w:r>
+      <w:r>
+        <w:rPr>
+          <w:rFonts w:ascii="Times New Roman" w:hAnsi="Times New Roman" w:eastAsia="Times New Roman" w:cs="Times New Roman"/>
+          <w:b w:val="0"/>
+          <w:bCs w:val="0"/>
+          <w:noProof w:val="0"/>
+          <w:sz w:val="24"/>
+          <w:szCs w:val="24"/>
+          <w:lang w:val="en-GB"/>
+        </w:rPr>
+        <w:t xml:space="preserve"> </w:t>
+      </w:r>
+      <w:r>
+        <w:rPr>
+          <w:rFonts w:ascii="Times New Roman" w:hAnsi="Times New Roman" w:eastAsia="Times New Roman" w:cs="Times New Roman"/>
+          <w:b w:val="0"/>
+          <w:bCs w:val="0"/>
+          <w:noProof w:val="0"/>
+          <w:sz w:val="24"/>
+          <w:szCs w:val="24"/>
+          <w:lang w:val="en-GB"/>
+        </w:rPr>
+        <w:t xml:space="preserve">costly home devices delay the </w:t>
+      </w:r>
+      <w:r>
+        <w:rPr>
+          <w:rFonts w:ascii="Times New Roman" w:hAnsi="Times New Roman" w:eastAsia="Times New Roman" w:cs="Times New Roman"/>
+          <w:b w:val="0"/>
+          <w:bCs w:val="0"/>
+          <w:noProof w:val="0"/>
+          <w:sz w:val="24"/>
+          <w:szCs w:val="24"/>
+          <w:lang w:val="en-GB"/>
+        </w:rPr>
+        <w:t>market</w:t>
+      </w:r>
+      <w:r>
+        <w:rPr>
+          <w:rFonts w:ascii="Times New Roman" w:hAnsi="Times New Roman" w:eastAsia="Times New Roman" w:cs="Times New Roman"/>
+          <w:b w:val="0"/>
+          <w:bCs w:val="0"/>
+          <w:noProof w:val="0"/>
+          <w:sz w:val="24"/>
+          <w:szCs w:val="24"/>
+          <w:lang w:val="en-GB"/>
+        </w:rPr>
+        <w:t>’</w:t>
+      </w:r>
+      <w:r>
+        <w:rPr>
+          <w:rFonts w:ascii="Times New Roman" w:hAnsi="Times New Roman" w:eastAsia="Times New Roman" w:cs="Times New Roman"/>
+          <w:b w:val="0"/>
+          <w:bCs w:val="0"/>
+          <w:noProof w:val="0"/>
+          <w:sz w:val="24"/>
+          <w:szCs w:val="24"/>
+          <w:lang w:val="en-GB"/>
+        </w:rPr>
+        <w:t>s</w:t>
+      </w:r>
+      <w:r>
+        <w:rPr>
+          <w:rFonts w:ascii="Times New Roman" w:hAnsi="Times New Roman" w:eastAsia="Times New Roman" w:cs="Times New Roman"/>
+          <w:b w:val="0"/>
+          <w:bCs w:val="0"/>
+          <w:noProof w:val="0"/>
+          <w:sz w:val="24"/>
+          <w:szCs w:val="24"/>
+          <w:lang w:val="en-GB"/>
+        </w:rPr>
+        <w:t xml:space="preserve"> growth </w:t>
+      </w:r>
+      <w:r>
+        <w:rPr>
+          <w:rFonts w:ascii="Times New Roman" w:hAnsi="Times New Roman" w:eastAsia="Times New Roman" w:cs="Times New Roman"/>
+          <w:b w:val="0"/>
+          <w:bCs w:val="0"/>
+          <w:noProof w:val="0"/>
+          <w:sz w:val="24"/>
+          <w:szCs w:val="24"/>
+          <w:lang w:val="en-GB"/>
+        </w:rPr>
+        <w:t>by acting as a limiting factor</w:t>
+      </w:r>
+      <w:r>
+        <w:rPr>
+          <w:rFonts w:ascii="Times New Roman" w:hAnsi="Times New Roman" w:eastAsia="Times New Roman" w:cs="Times New Roman"/>
+          <w:b w:val="0"/>
+          <w:bCs w:val="0"/>
+          <w:noProof w:val="0"/>
+          <w:sz w:val="24"/>
+          <w:szCs w:val="24"/>
+          <w:lang w:val="en-GB"/>
+        </w:rPr>
+        <w:t>.[</w:t>
+      </w:r>
+      <w:r>
+        <w:rPr>
+          <w:rFonts w:ascii="Times New Roman" w:hAnsi="Times New Roman" w:eastAsia="Times New Roman" w:cs="Times New Roman"/>
+          <w:b w:val="0"/>
+          <w:bCs w:val="0"/>
+          <w:noProof w:val="0"/>
+          <w:sz w:val="24"/>
+          <w:szCs w:val="24"/>
+          <w:lang w:val="en-GB"/>
+        </w:rPr>
+        <w:t>2</w:t>
+      </w:r>
+      <w:r>
+        <w:rPr>
+          <w:rFonts w:ascii="Times New Roman" w:hAnsi="Times New Roman" w:eastAsia="Times New Roman" w:cs="Times New Roman"/>
+          <w:b w:val="0"/>
+          <w:bCs w:val="0"/>
+          <w:noProof w:val="0"/>
+          <w:sz w:val="24"/>
+          <w:szCs w:val="24"/>
+          <w:lang w:val="en-GB"/>
+        </w:rPr>
+        <w:t>]</w:t>
+      </w:r>
+    </w:p>
+    <w:p>
+      <w:pPr>
+        <w:pStyle w:val="Normal"/>
+        <w:spacing w:before="240" w:beforeAutospacing="off" w:after="240" w:afterAutospacing="off"/>
+        <w:jc w:val="left"/>
+        <w:rPr>
+          <w:rFonts w:ascii="Times New Roman" w:hAnsi="Times New Roman" w:eastAsia="Times New Roman" w:cs="Times New Roman"/>
+          <w:noProof w:val="0"/>
+          <w:sz w:val="24"/>
+          <w:szCs w:val="24"/>
+          <w:lang w:val="en-GB"/>
+        </w:rPr>
+      </w:pPr>
+      <w:r>
+        <w:rPr>
+          <w:rFonts w:ascii="Times New Roman" w:hAnsi="Times New Roman" w:eastAsia="Times New Roman" w:cs="Times New Roman"/>
+          <w:noProof w:val="0"/>
+          <w:sz w:val="24"/>
+          <w:szCs w:val="24"/>
+          <w:lang w:val="en-GB"/>
+        </w:rPr>
+        <w:t xml:space="preserve">The </w:t>
+      </w:r>
+      <w:r>
+        <w:rPr>
+          <w:rFonts w:ascii="Times New Roman" w:hAnsi="Times New Roman" w:eastAsia="Times New Roman" w:cs="Times New Roman"/>
+          <w:noProof w:val="0"/>
+          <w:sz w:val="24"/>
+          <w:szCs w:val="24"/>
+          <w:lang w:val="en-GB"/>
+        </w:rPr>
+        <w:t>rapid</w:t>
+      </w:r>
+      <w:r>
+        <w:rPr>
+          <w:rFonts w:ascii="Times New Roman" w:hAnsi="Times New Roman" w:eastAsia="Times New Roman" w:cs="Times New Roman"/>
+          <w:noProof w:val="0"/>
+          <w:sz w:val="24"/>
+          <w:szCs w:val="24"/>
+          <w:lang w:val="en-GB"/>
+        </w:rPr>
+        <w:t xml:space="preserve"> development of Internet of Things (IoT) technology has </w:t>
+      </w:r>
+      <w:r>
+        <w:rPr>
+          <w:rFonts w:ascii="Times New Roman" w:hAnsi="Times New Roman" w:eastAsia="Times New Roman" w:cs="Times New Roman"/>
+          <w:noProof w:val="0"/>
+          <w:sz w:val="24"/>
+          <w:szCs w:val="24"/>
+          <w:lang w:val="en-GB"/>
+        </w:rPr>
+        <w:t xml:space="preserve">significantly </w:t>
+      </w:r>
+      <w:r>
+        <w:rPr>
+          <w:rFonts w:ascii="Times New Roman" w:hAnsi="Times New Roman" w:eastAsia="Times New Roman" w:cs="Times New Roman"/>
+          <w:noProof w:val="0"/>
+          <w:sz w:val="24"/>
+          <w:szCs w:val="24"/>
+          <w:lang w:val="en-GB"/>
+        </w:rPr>
+        <w:t>contributed</w:t>
+      </w:r>
+      <w:r>
+        <w:rPr>
+          <w:rFonts w:ascii="Times New Roman" w:hAnsi="Times New Roman" w:eastAsia="Times New Roman" w:cs="Times New Roman"/>
+          <w:noProof w:val="0"/>
+          <w:sz w:val="24"/>
+          <w:szCs w:val="24"/>
+          <w:lang w:val="en-GB"/>
+        </w:rPr>
+        <w:t xml:space="preserve"> </w:t>
+      </w:r>
+      <w:r>
+        <w:rPr>
+          <w:rFonts w:ascii="Times New Roman" w:hAnsi="Times New Roman" w:eastAsia="Times New Roman" w:cs="Times New Roman"/>
+          <w:noProof w:val="0"/>
+          <w:sz w:val="24"/>
+          <w:szCs w:val="24"/>
+          <w:lang w:val="en-GB"/>
+        </w:rPr>
+        <w:t xml:space="preserve">to </w:t>
+      </w:r>
+      <w:r>
+        <w:rPr>
+          <w:rFonts w:ascii="Times New Roman" w:hAnsi="Times New Roman" w:eastAsia="Times New Roman" w:cs="Times New Roman"/>
+          <w:noProof w:val="0"/>
+          <w:sz w:val="24"/>
+          <w:szCs w:val="24"/>
+          <w:lang w:val="en-GB"/>
+        </w:rPr>
+        <w:t>the growth of the smart home industry. IoT allows devices to communicate and work together, creating a connected home environment. This connectivity enhances device performance, improves energy efficiency, and gives users greater control over their systems</w:t>
+      </w:r>
+      <w:r>
+        <w:rPr>
+          <w:rFonts w:ascii="Times New Roman" w:hAnsi="Times New Roman" w:eastAsia="Times New Roman" w:cs="Times New Roman"/>
+          <w:noProof w:val="0"/>
+          <w:sz w:val="24"/>
+          <w:szCs w:val="24"/>
+          <w:lang w:val="en-GB"/>
+        </w:rPr>
+        <w:t>.</w:t>
+      </w:r>
+      <w:r>
+        <w:rPr>
+          <w:rFonts w:ascii="Times New Roman" w:hAnsi="Times New Roman" w:eastAsia="Times New Roman" w:cs="Times New Roman"/>
+          <w:noProof w:val="0"/>
+          <w:sz w:val="24"/>
+          <w:szCs w:val="24"/>
+          <w:lang w:val="en-GB"/>
+        </w:rPr>
+        <w:t>[</w:t>
+      </w:r>
+      <w:r>
+        <w:rPr>
+          <w:rFonts w:ascii="Times New Roman" w:hAnsi="Times New Roman" w:eastAsia="Times New Roman" w:cs="Times New Roman"/>
+          <w:noProof w:val="0"/>
+          <w:sz w:val="24"/>
+          <w:szCs w:val="24"/>
+          <w:lang w:val="en-GB"/>
+        </w:rPr>
+        <w:t>4]</w:t>
+      </w:r>
+      <w:r>
+        <w:rPr>
+          <w:rFonts w:ascii="Times New Roman" w:hAnsi="Times New Roman" w:eastAsia="Times New Roman" w:cs="Times New Roman"/>
+          <w:noProof w:val="0"/>
+          <w:sz w:val="24"/>
+          <w:szCs w:val="24"/>
+          <w:lang w:val="en-GB"/>
+        </w:rPr>
+        <w:t xml:space="preserve"> </w:t>
+      </w:r>
+    </w:p>
+    <w:p>
+      <w:pPr>
+        <w:pStyle w:val="Normal"/>
+        <w:spacing w:before="240" w:beforeAutospacing="off" w:after="240" w:afterAutospacing="off"/>
+        <w:jc w:val="left"/>
+        <w:rPr>
+          <w:rFonts w:ascii="Times New Roman" w:hAnsi="Times New Roman" w:eastAsia="Times New Roman" w:cs="Times New Roman"/>
+          <w:noProof w:val="0"/>
+          <w:sz w:val="24"/>
+          <w:szCs w:val="24"/>
+          <w:lang w:val="en-GB"/>
+        </w:rPr>
+      </w:pPr>
+      <w:r>
+        <w:rPr>
+          <w:rFonts w:ascii="Times New Roman" w:hAnsi="Times New Roman" w:eastAsia="Times New Roman" w:cs="Times New Roman"/>
+          <w:noProof w:val="0"/>
+          <w:sz w:val="24"/>
+          <w:szCs w:val="24"/>
+          <w:lang w:val="en-GB"/>
+        </w:rPr>
+        <w:t>The</w:t>
+      </w:r>
+      <w:r>
+        <w:rPr>
+          <w:rFonts w:ascii="Times New Roman" w:hAnsi="Times New Roman" w:eastAsia="Times New Roman" w:cs="Times New Roman"/>
+          <w:noProof w:val="0"/>
+          <w:sz w:val="24"/>
+          <w:szCs w:val="24"/>
+          <w:lang w:val="en-GB"/>
+        </w:rPr>
+        <w:t xml:space="preserve"> growing emphasis on energy efficiency and sustainability among consumers is an important trend in the smart home industry. Smart home technologies, such as smart thermostats, lighting systems, and energy-saving appliances, enable users to </w:t>
+      </w:r>
+      <w:r>
+        <w:rPr>
+          <w:rFonts w:ascii="Times New Roman" w:hAnsi="Times New Roman" w:eastAsia="Times New Roman" w:cs="Times New Roman"/>
+          <w:noProof w:val="0"/>
+          <w:sz w:val="24"/>
+          <w:szCs w:val="24"/>
+          <w:lang w:val="en-GB"/>
+        </w:rPr>
+        <w:t>m</w:t>
+      </w:r>
+      <w:r>
+        <w:rPr>
+          <w:rFonts w:ascii="Times New Roman" w:hAnsi="Times New Roman" w:eastAsia="Times New Roman" w:cs="Times New Roman"/>
+          <w:noProof w:val="0"/>
+          <w:sz w:val="24"/>
+          <w:szCs w:val="24"/>
+          <w:lang w:val="en-GB"/>
+        </w:rPr>
+        <w:t>onitor</w:t>
+      </w:r>
+      <w:r>
+        <w:rPr>
+          <w:rFonts w:ascii="Times New Roman" w:hAnsi="Times New Roman" w:eastAsia="Times New Roman" w:cs="Times New Roman"/>
+          <w:noProof w:val="0"/>
+          <w:sz w:val="24"/>
+          <w:szCs w:val="24"/>
+          <w:lang w:val="en-GB"/>
+        </w:rPr>
+        <w:t xml:space="preserve"> </w:t>
+      </w:r>
+      <w:r>
+        <w:rPr>
+          <w:rFonts w:ascii="Times New Roman" w:hAnsi="Times New Roman" w:eastAsia="Times New Roman" w:cs="Times New Roman"/>
+          <w:noProof w:val="0"/>
+          <w:sz w:val="24"/>
+          <w:szCs w:val="24"/>
+          <w:lang w:val="en-GB"/>
+        </w:rPr>
+        <w:t>and manage their energy consumption more effectively.</w:t>
+      </w:r>
+      <w:r>
+        <w:rPr>
+          <w:rFonts w:ascii="Times New Roman" w:hAnsi="Times New Roman" w:eastAsia="Times New Roman" w:cs="Times New Roman"/>
+          <w:noProof w:val="0"/>
+          <w:sz w:val="24"/>
+          <w:szCs w:val="24"/>
+          <w:lang w:val="en-GB"/>
+        </w:rPr>
+        <w:t>[</w:t>
+      </w:r>
+      <w:r>
+        <w:rPr>
+          <w:rFonts w:ascii="Times New Roman" w:hAnsi="Times New Roman" w:eastAsia="Times New Roman" w:cs="Times New Roman"/>
+          <w:noProof w:val="0"/>
+          <w:sz w:val="24"/>
+          <w:szCs w:val="24"/>
+          <w:lang w:val="en-GB"/>
+        </w:rPr>
+        <w:t>4]</w:t>
+      </w:r>
+    </w:p>
+    <w:p>
+      <w:pPr>
+        <w:pStyle w:val="Normal"/>
+        <w:spacing w:before="240" w:beforeAutospacing="off" w:after="240" w:afterAutospacing="off"/>
+        <w:jc w:val="left"/>
+        <w:rPr>
+          <w:rFonts w:ascii="Times New Roman" w:hAnsi="Times New Roman" w:eastAsia="Times New Roman" w:cs="Times New Roman"/>
+          <w:noProof w:val="0"/>
+          <w:sz w:val="24"/>
+          <w:szCs w:val="24"/>
+          <w:lang w:val="en-GB"/>
+        </w:rPr>
+      </w:pPr>
+      <w:r>
+        <w:rPr>
+          <w:rFonts w:ascii="Times New Roman" w:hAnsi="Times New Roman" w:eastAsia="Times New Roman" w:cs="Times New Roman"/>
+          <w:noProof w:val="0"/>
+          <w:sz w:val="24"/>
+          <w:szCs w:val="24"/>
+          <w:lang w:val="en-GB"/>
+        </w:rPr>
+        <w:t xml:space="preserve">The growing need for home security and safety solutions is fuelling the expansion of the smart home industry. Consumers are increasingly adopting smart security technologies, including smart cameras, video doorbells, motion detectors, and smart locks. These devices offer real-time notifications and remote monitoring features, which improve overall home security and provide greater peace of mind for </w:t>
+      </w:r>
+      <w:r>
+        <w:rPr>
+          <w:rFonts w:ascii="Times New Roman" w:hAnsi="Times New Roman" w:eastAsia="Times New Roman" w:cs="Times New Roman"/>
+          <w:noProof w:val="0"/>
+          <w:sz w:val="24"/>
+          <w:szCs w:val="24"/>
+          <w:lang w:val="en-GB"/>
+        </w:rPr>
+        <w:t>homeowners.</w:t>
+      </w:r>
+      <w:r>
+        <w:rPr>
+          <w:rFonts w:ascii="Times New Roman" w:hAnsi="Times New Roman" w:eastAsia="Times New Roman" w:cs="Times New Roman"/>
+          <w:noProof w:val="0"/>
+          <w:sz w:val="24"/>
+          <w:szCs w:val="24"/>
+          <w:lang w:val="en-GB"/>
+        </w:rPr>
+        <w:t>[</w:t>
+      </w:r>
+      <w:r>
+        <w:rPr>
+          <w:rFonts w:ascii="Times New Roman" w:hAnsi="Times New Roman" w:eastAsia="Times New Roman" w:cs="Times New Roman"/>
+          <w:noProof w:val="0"/>
+          <w:sz w:val="24"/>
+          <w:szCs w:val="24"/>
+          <w:lang w:val="en-GB"/>
+        </w:rPr>
+        <w:t>4]</w:t>
+      </w:r>
+    </w:p>
+    <w:p>
+      <w:pPr>
+        <w:spacing w:before="240" w:beforeAutospacing="off" w:after="240" w:afterAutospacing="off"/>
+        <w:jc w:val="left"/>
+      </w:pPr>
+      <w:r>
+        <w:rPr>
+          <w:rFonts w:ascii="Times New Roman" w:hAnsi="Times New Roman" w:eastAsia="Times New Roman" w:cs="Times New Roman"/>
+          <w:noProof w:val="0"/>
+          <w:sz w:val="24"/>
+          <w:szCs w:val="24"/>
+          <w:lang w:val="en-GB"/>
+        </w:rPr>
+        <w:t xml:space="preserve">This project addresses the issue of </w:t>
+      </w:r>
+      <w:r>
+        <w:rPr>
+          <w:rFonts w:ascii="Times New Roman" w:hAnsi="Times New Roman" w:eastAsia="Times New Roman" w:cs="Times New Roman"/>
+          <w:noProof w:val="0"/>
+          <w:sz w:val="24"/>
+          <w:szCs w:val="24"/>
+          <w:lang w:val="en-GB"/>
+        </w:rPr>
+        <w:t>high costs</w:t>
+      </w:r>
+      <w:r>
+        <w:rPr>
+          <w:rFonts w:ascii="Times New Roman" w:hAnsi="Times New Roman" w:eastAsia="Times New Roman" w:cs="Times New Roman"/>
+          <w:noProof w:val="0"/>
+          <w:sz w:val="24"/>
+          <w:szCs w:val="24"/>
+          <w:lang w:val="en-GB"/>
+        </w:rPr>
+        <w:t xml:space="preserve"> and system complexity by designing a low-cost, Arduino-based smart home controller that serves as a practical and affordable alternative to commercial solutions.</w:t>
+      </w:r>
+    </w:p>
+    <w:p>
+      <w:pPr>
+        <w:pStyle w:val="Normal"/>
+        <w:spacing w:before="240" w:beforeAutospacing="off" w:after="240" w:afterAutospacing="off"/>
+        <w:jc w:val="left"/>
+        <w:rPr>
+          <w:rFonts w:ascii="Times New Roman" w:hAnsi="Times New Roman" w:eastAsia="Times New Roman" w:cs="Times New Roman"/>
+          <w:noProof w:val="0"/>
+          <w:sz w:val="24"/>
+          <w:szCs w:val="24"/>
+          <w:lang w:val="en-GB"/>
+        </w:rPr>
+      </w:pPr>
+    </w:p>
+    <w:p>
+      <w:pPr>
+        <w:pStyle w:val="Normal"/>
+        <w:spacing w:before="240" w:beforeAutospacing="off" w:after="240" w:afterAutospacing="off"/>
+        <w:jc w:val="left"/>
+        <w:rPr>
+          <w:rFonts w:ascii="Times New Roman" w:hAnsi="Times New Roman" w:eastAsia="Times New Roman" w:cs="Times New Roman"/>
+          <w:noProof w:val="0"/>
+          <w:sz w:val="24"/>
+          <w:szCs w:val="24"/>
+          <w:lang w:val="en-GB"/>
+        </w:rPr>
+      </w:pPr>
+    </w:p>
+    <w:p>
+      <w:pPr>
+        <w:spacing w:before="240" w:beforeAutospacing="off" w:after="240" w:afterAutospacing="off"/>
+        <w:jc w:val="left"/>
+        <w:rPr>
+          <w:rFonts w:ascii="Times New Roman" w:hAnsi="Times New Roman" w:eastAsia="Times New Roman" w:cs="Times New Roman"/>
+          <w:noProof w:val="0"/>
+          <w:sz w:val="24"/>
+          <w:szCs w:val="24"/>
+          <w:lang w:val="en-GB"/>
+        </w:rPr>
+      </w:pPr>
+    </w:p>
+    <w:p>
+      <w:pPr>
+        <w:spacing w:before="240" w:beforeAutospacing="off" w:after="240" w:afterAutospacing="off"/>
+        <w:jc w:val="left"/>
       </w:pPr>
       <w:r>
         <w:rPr>
@@ -248,12 +1789,14 @@
       <w:r>
         <w:rPr>
           <w:rFonts w:ascii="Times New Roman" w:hAnsi="Times New Roman" w:eastAsia="Times New Roman" w:cs="Times New Roman"/>
-          <w:noProof w:val="0"/>
-          <w:sz w:val="24"/>
-          <w:szCs w:val="24"/>
-          <w:lang w:val="en-GB"/>
-        </w:rPr>
-        <w:t>This project contributes to the growing field of embedded home automation by demonstrating a practical, low-cost alternative to expensive commercial smart home systems. By integrating multiple sensors, actuators, and input interfaces into a single cohesive system, this work demonstrates how microcontroller-based solutions can deliver intelligent automation without relying on cloud connectivity or proprietary hardware. The system serves as a proof of concept for affordable smart home technology applicable in residential and small commercial environments.</w:t>
+          <w:b w:val="1"/>
+          <w:bCs w:val="1"/>
+          <w:noProof w:val="0"/>
+          <w:sz w:val="24"/>
+          <w:szCs w:val="24"/>
+          <w:lang w:val="en-GB"/>
+        </w:rPr>
+        <w:t>1.3 Aim of the Project</w:t>
       </w:r>
     </w:p>
     <w:p>
@@ -271,7 +1814,7 @@
           <w:szCs w:val="24"/>
           <w:lang w:val="en-GB"/>
         </w:rPr>
-        <w:t>1.3 Aim of the Project</w:t>
+        <w:t>1.4 Objectives</w:t>
       </w:r>
     </w:p>
     <w:p>
@@ -282,12 +1825,14 @@
       <w:r>
         <w:rPr>
           <w:rFonts w:ascii="Times New Roman" w:hAnsi="Times New Roman" w:eastAsia="Times New Roman" w:cs="Times New Roman"/>
-          <w:noProof w:val="0"/>
-          <w:sz w:val="24"/>
-          <w:szCs w:val="24"/>
-          <w:lang w:val="en-GB"/>
-        </w:rPr>
-        <w:t>The aim of this project is to design, build, and evaluate a multi-interface Smart Home Controller using an Arduino Nano microcontroller that enables users to monitor environmental conditions and control home actuators through multiple input methods including a matrix keypad, IR remote, and joystick, while providing real-time feedback via an LCD display and LED indicators.</w:t>
+          <w:b w:val="1"/>
+          <w:bCs w:val="1"/>
+          <w:noProof w:val="0"/>
+          <w:sz w:val="24"/>
+          <w:szCs w:val="24"/>
+          <w:lang w:val="en-GB"/>
+        </w:rPr>
+        <w:t>1.5 Scope and Limitations</w:t>
       </w:r>
     </w:p>
     <w:p>
@@ -305,450 +1850,115 @@
           <w:szCs w:val="24"/>
           <w:lang w:val="en-GB"/>
         </w:rPr>
-        <w:t>1.4 Objectives</w:t>
+        <w:t>1.6 Structure of Thesis</w:t>
       </w:r>
     </w:p>
     <w:p>
       <w:pPr>
         <w:spacing w:before="240" w:beforeAutospacing="off" w:after="240" w:afterAutospacing="off"/>
         <w:jc w:val="left"/>
-      </w:pPr>
-      <w:r>
-        <w:rPr>
-          <w:rFonts w:ascii="Times New Roman" w:hAnsi="Times New Roman" w:eastAsia="Times New Roman" w:cs="Times New Roman"/>
-          <w:noProof w:val="0"/>
-          <w:sz w:val="24"/>
-          <w:szCs w:val="24"/>
-          <w:lang w:val="en-GB"/>
-        </w:rPr>
-        <w:t>The following objectives were defined to achieve the aim of this project:</w:t>
-      </w:r>
-    </w:p>
-    <w:p>
-      <w:pPr>
-        <w:pStyle w:val="ListParagraph"/>
-        <w:numPr>
-          <w:ilvl w:val="0"/>
-          <w:numId w:val="1"/>
-        </w:numPr>
-        <w:spacing w:before="0" w:beforeAutospacing="off" w:after="0" w:afterAutospacing="off"/>
-        <w:jc w:val="left"/>
-        <w:rPr>
-          <w:rFonts w:ascii="Times New Roman" w:hAnsi="Times New Roman" w:eastAsia="Times New Roman" w:cs="Times New Roman"/>
-          <w:noProof w:val="0"/>
-          <w:sz w:val="24"/>
-          <w:szCs w:val="24"/>
-          <w:lang w:val="en-GB"/>
-        </w:rPr>
-      </w:pPr>
-      <w:r>
-        <w:rPr>
-          <w:rFonts w:ascii="Times New Roman" w:hAnsi="Times New Roman" w:eastAsia="Times New Roman" w:cs="Times New Roman"/>
-          <w:noProof w:val="0"/>
-          <w:sz w:val="24"/>
-          <w:szCs w:val="24"/>
-          <w:lang w:val="en-GB"/>
-        </w:rPr>
-        <w:t>To design a Finite State Machine architecture to manage multiple system modes including monitoring, alert, and manual override.</w:t>
-      </w:r>
-    </w:p>
-    <w:p>
-      <w:pPr>
-        <w:pStyle w:val="ListParagraph"/>
-        <w:numPr>
-          <w:ilvl w:val="0"/>
-          <w:numId w:val="1"/>
-        </w:numPr>
-        <w:spacing w:before="0" w:beforeAutospacing="off" w:after="0" w:afterAutospacing="off"/>
-        <w:jc w:val="left"/>
-        <w:rPr>
-          <w:rFonts w:ascii="Times New Roman" w:hAnsi="Times New Roman" w:eastAsia="Times New Roman" w:cs="Times New Roman"/>
-          <w:noProof w:val="0"/>
-          <w:sz w:val="24"/>
-          <w:szCs w:val="24"/>
-          <w:lang w:val="en-GB"/>
-        </w:rPr>
-      </w:pPr>
-      <w:r>
-        <w:rPr>
-          <w:rFonts w:ascii="Times New Roman" w:hAnsi="Times New Roman" w:eastAsia="Times New Roman" w:cs="Times New Roman"/>
-          <w:noProof w:val="0"/>
-          <w:sz w:val="24"/>
-          <w:szCs w:val="24"/>
-          <w:lang w:val="en-GB"/>
-        </w:rPr>
-        <w:t>To integrate environmental sensors including BMP180 and LM35 for temperature and pressure monitoring and HC-SR04 for occupancy detection.</w:t>
-      </w:r>
-    </w:p>
-    <w:p>
-      <w:pPr>
-        <w:pStyle w:val="ListParagraph"/>
-        <w:numPr>
-          <w:ilvl w:val="0"/>
-          <w:numId w:val="1"/>
-        </w:numPr>
-        <w:spacing w:before="0" w:beforeAutospacing="off" w:after="0" w:afterAutospacing="off"/>
-        <w:jc w:val="left"/>
-        <w:rPr>
-          <w:rFonts w:ascii="Times New Roman" w:hAnsi="Times New Roman" w:eastAsia="Times New Roman" w:cs="Times New Roman"/>
-          <w:noProof w:val="0"/>
-          <w:sz w:val="24"/>
-          <w:szCs w:val="24"/>
-          <w:lang w:val="en-GB"/>
-        </w:rPr>
-      </w:pPr>
-      <w:r>
-        <w:rPr>
-          <w:rFonts w:ascii="Times New Roman" w:hAnsi="Times New Roman" w:eastAsia="Times New Roman" w:cs="Times New Roman"/>
-          <w:noProof w:val="0"/>
-          <w:sz w:val="24"/>
-          <w:szCs w:val="24"/>
-          <w:lang w:val="en-GB"/>
-        </w:rPr>
-        <w:t>To implement multi-modal user input via a 4×4 matrix keypad, IR remote control, and joystick.</w:t>
-      </w:r>
-    </w:p>
-    <w:p>
-      <w:pPr>
-        <w:pStyle w:val="ListParagraph"/>
-        <w:numPr>
-          <w:ilvl w:val="0"/>
-          <w:numId w:val="1"/>
-        </w:numPr>
-        <w:spacing w:before="0" w:beforeAutospacing="off" w:after="0" w:afterAutospacing="off"/>
-        <w:jc w:val="left"/>
-        <w:rPr>
-          <w:rFonts w:ascii="Times New Roman" w:hAnsi="Times New Roman" w:eastAsia="Times New Roman" w:cs="Times New Roman"/>
-          <w:noProof w:val="0"/>
-          <w:sz w:val="24"/>
-          <w:szCs w:val="24"/>
-          <w:lang w:val="en-GB"/>
-        </w:rPr>
-      </w:pPr>
-      <w:r>
-        <w:rPr>
-          <w:rFonts w:ascii="Times New Roman" w:hAnsi="Times New Roman" w:eastAsia="Times New Roman" w:cs="Times New Roman"/>
-          <w:noProof w:val="0"/>
-          <w:sz w:val="24"/>
-          <w:szCs w:val="24"/>
-          <w:lang w:val="en-GB"/>
-        </w:rPr>
-        <w:t>To utilize I2C communication protocol to manage multiple devices including LCD display and PCF8574 I/O expander on a shared bus.</w:t>
-      </w:r>
-    </w:p>
-    <w:p>
-      <w:pPr>
-        <w:pStyle w:val="ListParagraph"/>
-        <w:numPr>
-          <w:ilvl w:val="0"/>
-          <w:numId w:val="1"/>
-        </w:numPr>
-        <w:spacing w:before="0" w:beforeAutospacing="off" w:after="0" w:afterAutospacing="off"/>
-        <w:jc w:val="left"/>
-        <w:rPr>
-          <w:rFonts w:ascii="Times New Roman" w:hAnsi="Times New Roman" w:eastAsia="Times New Roman" w:cs="Times New Roman"/>
-          <w:noProof w:val="0"/>
-          <w:sz w:val="24"/>
-          <w:szCs w:val="24"/>
-          <w:lang w:val="en-GB"/>
-        </w:rPr>
-      </w:pPr>
-      <w:r>
-        <w:rPr>
-          <w:rFonts w:ascii="Times New Roman" w:hAnsi="Times New Roman" w:eastAsia="Times New Roman" w:cs="Times New Roman"/>
-          <w:noProof w:val="0"/>
-          <w:sz w:val="24"/>
-          <w:szCs w:val="24"/>
-          <w:lang w:val="en-GB"/>
-        </w:rPr>
-        <w:t>To implement serial event logging for system activity recording and security analysis.</w:t>
-      </w:r>
-    </w:p>
-    <w:p>
-      <w:pPr>
-        <w:pStyle w:val="ListParagraph"/>
-        <w:numPr>
-          <w:ilvl w:val="0"/>
-          <w:numId w:val="1"/>
-        </w:numPr>
-        <w:spacing w:before="0" w:beforeAutospacing="off" w:after="0" w:afterAutospacing="off"/>
-        <w:jc w:val="left"/>
-        <w:rPr>
-          <w:rFonts w:ascii="Times New Roman" w:hAnsi="Times New Roman" w:eastAsia="Times New Roman" w:cs="Times New Roman"/>
-          <w:noProof w:val="0"/>
-          <w:sz w:val="24"/>
-          <w:szCs w:val="24"/>
-          <w:lang w:val="en-GB"/>
-        </w:rPr>
-      </w:pPr>
-      <w:r>
-        <w:rPr>
-          <w:rFonts w:ascii="Times New Roman" w:hAnsi="Times New Roman" w:eastAsia="Times New Roman" w:cs="Times New Roman"/>
-          <w:noProof w:val="0"/>
-          <w:sz w:val="24"/>
-          <w:szCs w:val="24"/>
-          <w:lang w:val="en-GB"/>
-        </w:rPr>
-        <w:t>To evaluate system usability through structured testing with end users.</w:t>
-      </w:r>
-    </w:p>
-    <w:p>
-      <w:pPr>
-        <w:spacing w:before="240" w:beforeAutospacing="off" w:after="240" w:afterAutospacing="off"/>
-        <w:jc w:val="left"/>
-      </w:pPr>
-      <w:r>
-        <w:rPr>
-          <w:rFonts w:ascii="Times New Roman" w:hAnsi="Times New Roman" w:eastAsia="Times New Roman" w:cs="Times New Roman"/>
-          <w:b w:val="1"/>
-          <w:bCs w:val="1"/>
-          <w:noProof w:val="0"/>
-          <w:sz w:val="24"/>
-          <w:szCs w:val="24"/>
-          <w:lang w:val="en-GB"/>
-        </w:rPr>
-        <w:t>1.5 Scope and Limitations</w:t>
-      </w:r>
-    </w:p>
-    <w:p>
-      <w:pPr>
-        <w:spacing w:before="240" w:beforeAutospacing="off" w:after="240" w:afterAutospacing="off"/>
-        <w:jc w:val="left"/>
-      </w:pPr>
-      <w:r>
-        <w:rPr>
-          <w:rFonts w:ascii="Times New Roman" w:hAnsi="Times New Roman" w:eastAsia="Times New Roman" w:cs="Times New Roman"/>
-          <w:noProof w:val="0"/>
-          <w:sz w:val="24"/>
-          <w:szCs w:val="24"/>
-          <w:lang w:val="en-GB"/>
-        </w:rPr>
-        <w:t>This project focuses on the design and implementation of a standalone embedded smart home controller operating without cloud connectivity or wireless communication. The system is limited to the hardware components available including Arduino Nano, BMP180, LM35, HC-SR04, SG90 servo, 1602A LCD, PCF8574 expander, IR receiver, matrix keypad, and joystick. The servo motor simulates a door lock actuator rather than controlling a physical door mechanism. The system operates as a prototype and is not intended for full residential deployment. Cloud integration and wireless connectivity are identified as areas for future development.</w:t>
-      </w:r>
-    </w:p>
-    <w:p>
-      <w:pPr>
-        <w:spacing w:before="240" w:beforeAutospacing="off" w:after="240" w:afterAutospacing="off"/>
-        <w:jc w:val="left"/>
-      </w:pPr>
-      <w:r>
-        <w:rPr>
-          <w:rFonts w:ascii="Times New Roman" w:hAnsi="Times New Roman" w:eastAsia="Times New Roman" w:cs="Times New Roman"/>
-          <w:b w:val="1"/>
-          <w:bCs w:val="1"/>
-          <w:noProof w:val="0"/>
-          <w:sz w:val="24"/>
-          <w:szCs w:val="24"/>
-          <w:lang w:val="en-GB"/>
-        </w:rPr>
-        <w:t>1.6 Structure of Thesis</w:t>
-      </w:r>
-    </w:p>
-    <w:p>
-      <w:pPr>
-        <w:spacing w:before="240" w:beforeAutospacing="off" w:after="240" w:afterAutospacing="off"/>
-        <w:jc w:val="left"/>
-      </w:pPr>
-      <w:r>
-        <w:rPr>
-          <w:rFonts w:ascii="Times New Roman" w:hAnsi="Times New Roman" w:eastAsia="Times New Roman" w:cs="Times New Roman"/>
-          <w:noProof w:val="0"/>
-          <w:sz w:val="24"/>
-          <w:szCs w:val="24"/>
-          <w:lang w:val="en-GB"/>
-        </w:rPr>
-        <w:t xml:space="preserve">This thesis is organized into six chapters. </w:t>
-      </w:r>
-    </w:p>
-    <w:p>
-      <w:pPr>
-        <w:spacing w:before="240" w:beforeAutospacing="off" w:after="240" w:afterAutospacing="off"/>
-        <w:jc w:val="left"/>
-      </w:pPr>
-      <w:r>
-        <w:rPr>
-          <w:rFonts w:ascii="Times New Roman" w:hAnsi="Times New Roman" w:eastAsia="Times New Roman" w:cs="Times New Roman"/>
-          <w:noProof w:val="0"/>
-          <w:sz w:val="24"/>
-          <w:szCs w:val="24"/>
-          <w:lang w:val="en-GB"/>
-        </w:rPr>
-        <w:t xml:space="preserve">Chapter 1 </w:t>
-      </w:r>
-      <w:r>
-        <w:rPr>
-          <w:rFonts w:ascii="Times New Roman" w:hAnsi="Times New Roman" w:eastAsia="Times New Roman" w:cs="Times New Roman"/>
-          <w:noProof w:val="0"/>
-          <w:sz w:val="24"/>
-          <w:szCs w:val="24"/>
-          <w:lang w:val="en-GB"/>
-        </w:rPr>
-        <w:t>provides an introduction to</w:t>
-      </w:r>
-      <w:r>
-        <w:rPr>
-          <w:rFonts w:ascii="Times New Roman" w:hAnsi="Times New Roman" w:eastAsia="Times New Roman" w:cs="Times New Roman"/>
-          <w:noProof w:val="0"/>
-          <w:sz w:val="24"/>
-          <w:szCs w:val="24"/>
-          <w:lang w:val="en-GB"/>
-        </w:rPr>
-        <w:t xml:space="preserve"> the project including background, aims, </w:t>
-      </w:r>
-      <w:r>
-        <w:rPr>
-          <w:rFonts w:ascii="Times New Roman" w:hAnsi="Times New Roman" w:eastAsia="Times New Roman" w:cs="Times New Roman"/>
-          <w:noProof w:val="0"/>
-          <w:sz w:val="24"/>
-          <w:szCs w:val="24"/>
-          <w:lang w:val="en-GB"/>
-        </w:rPr>
-        <w:t>objectives</w:t>
-      </w:r>
-      <w:r>
-        <w:rPr>
-          <w:rFonts w:ascii="Times New Roman" w:hAnsi="Times New Roman" w:eastAsia="Times New Roman" w:cs="Times New Roman"/>
-          <w:noProof w:val="0"/>
-          <w:sz w:val="24"/>
-          <w:szCs w:val="24"/>
-          <w:lang w:val="en-GB"/>
-        </w:rPr>
-        <w:t xml:space="preserve">, and scope. </w:t>
-      </w:r>
-    </w:p>
-    <w:p>
-      <w:pPr>
-        <w:spacing w:before="240" w:beforeAutospacing="off" w:after="240" w:afterAutospacing="off"/>
-        <w:jc w:val="left"/>
-      </w:pPr>
-      <w:r>
-        <w:rPr>
-          <w:rFonts w:ascii="Times New Roman" w:hAnsi="Times New Roman" w:eastAsia="Times New Roman" w:cs="Times New Roman"/>
-          <w:noProof w:val="0"/>
-          <w:sz w:val="24"/>
-          <w:szCs w:val="24"/>
-          <w:lang w:val="en-GB"/>
-        </w:rPr>
-        <w:t xml:space="preserve">Chapter 2 presents a review of existing literature on smart home systems, embedded technologies, and </w:t>
-      </w:r>
-      <w:r>
-        <w:rPr>
-          <w:rFonts w:ascii="Times New Roman" w:hAnsi="Times New Roman" w:eastAsia="Times New Roman" w:cs="Times New Roman"/>
-          <w:noProof w:val="0"/>
-          <w:sz w:val="24"/>
-          <w:szCs w:val="24"/>
-          <w:lang w:val="en-GB"/>
-        </w:rPr>
-        <w:t>IIoT</w:t>
-      </w:r>
-      <w:r>
-        <w:rPr>
-          <w:rFonts w:ascii="Times New Roman" w:hAnsi="Times New Roman" w:eastAsia="Times New Roman" w:cs="Times New Roman"/>
-          <w:noProof w:val="0"/>
-          <w:sz w:val="24"/>
-          <w:szCs w:val="24"/>
-          <w:lang w:val="en-GB"/>
-        </w:rPr>
-        <w:t xml:space="preserve"> trends. </w:t>
-      </w:r>
-    </w:p>
-    <w:p>
-      <w:pPr>
-        <w:spacing w:before="240" w:beforeAutospacing="off" w:after="240" w:afterAutospacing="off"/>
-        <w:jc w:val="left"/>
-      </w:pPr>
-      <w:r>
-        <w:rPr>
-          <w:rFonts w:ascii="Times New Roman" w:hAnsi="Times New Roman" w:eastAsia="Times New Roman" w:cs="Times New Roman"/>
-          <w:noProof w:val="0"/>
-          <w:sz w:val="24"/>
-          <w:szCs w:val="24"/>
-          <w:lang w:val="en-GB"/>
-        </w:rPr>
-        <w:t xml:space="preserve">Chapter 3 details the system design including hardware selection, circuit design, and software architecture. </w:t>
-      </w:r>
-    </w:p>
-    <w:p>
-      <w:pPr>
-        <w:spacing w:before="240" w:beforeAutospacing="off" w:after="240" w:afterAutospacing="off"/>
-        <w:jc w:val="left"/>
-      </w:pPr>
-      <w:r>
-        <w:rPr>
-          <w:rFonts w:ascii="Times New Roman" w:hAnsi="Times New Roman" w:eastAsia="Times New Roman" w:cs="Times New Roman"/>
-          <w:noProof w:val="0"/>
-          <w:sz w:val="24"/>
-          <w:szCs w:val="24"/>
-          <w:lang w:val="en-GB"/>
-        </w:rPr>
-        <w:t xml:space="preserve">Chapter 4 describes the implementation process covering hardware assembly and software development. </w:t>
-      </w:r>
-    </w:p>
-    <w:p>
-      <w:pPr>
-        <w:spacing w:before="240" w:beforeAutospacing="off" w:after="240" w:afterAutospacing="off"/>
-        <w:jc w:val="left"/>
-      </w:pPr>
-      <w:r>
-        <w:rPr>
-          <w:rFonts w:ascii="Times New Roman" w:hAnsi="Times New Roman" w:eastAsia="Times New Roman" w:cs="Times New Roman"/>
-          <w:noProof w:val="0"/>
-          <w:sz w:val="24"/>
-          <w:szCs w:val="24"/>
-          <w:lang w:val="en-GB"/>
-        </w:rPr>
-        <w:t xml:space="preserve">Chapter 5 presents the testing and evaluation results including </w:t>
-      </w:r>
-      <w:r>
-        <w:rPr>
-          <w:rFonts w:ascii="Times New Roman" w:hAnsi="Times New Roman" w:eastAsia="Times New Roman" w:cs="Times New Roman"/>
-          <w:noProof w:val="0"/>
-          <w:sz w:val="24"/>
-          <w:szCs w:val="24"/>
-          <w:lang w:val="en-GB"/>
-        </w:rPr>
-        <w:t>component</w:t>
-      </w:r>
-      <w:r>
-        <w:rPr>
-          <w:rFonts w:ascii="Times New Roman" w:hAnsi="Times New Roman" w:eastAsia="Times New Roman" w:cs="Times New Roman"/>
-          <w:noProof w:val="0"/>
-          <w:sz w:val="24"/>
-          <w:szCs w:val="24"/>
-          <w:lang w:val="en-GB"/>
-        </w:rPr>
-        <w:t xml:space="preserve"> testing, system integration testing, and user evaluation. </w:t>
-      </w:r>
-    </w:p>
-    <w:p>
-      <w:pPr>
-        <w:spacing w:before="240" w:beforeAutospacing="off" w:after="240" w:afterAutospacing="off"/>
-        <w:jc w:val="left"/>
-      </w:pPr>
-      <w:r>
-        <w:rPr>
-          <w:rFonts w:ascii="Times New Roman" w:hAnsi="Times New Roman" w:eastAsia="Times New Roman" w:cs="Times New Roman"/>
-          <w:noProof w:val="0"/>
-          <w:sz w:val="24"/>
-          <w:szCs w:val="24"/>
-          <w:lang w:val="en-GB"/>
-        </w:rPr>
-        <w:t>Chapter 6 concludes the thesis with a summary of achievements, limitations, and recommendations for future work.</w:t>
+        <w:rPr>
+          <w:rFonts w:ascii="Times New Roman" w:hAnsi="Times New Roman" w:eastAsia="Times New Roman" w:cs="Times New Roman"/>
+          <w:noProof w:val="0"/>
+          <w:sz w:val="28"/>
+          <w:szCs w:val="28"/>
+          <w:lang w:val="en-GB"/>
+        </w:rPr>
+      </w:pPr>
+      <w:r>
+        <w:rPr>
+          <w:rFonts w:ascii="Times New Roman" w:hAnsi="Times New Roman" w:eastAsia="Times New Roman" w:cs="Times New Roman"/>
+          <w:noProof w:val="0"/>
+          <w:sz w:val="28"/>
+          <w:szCs w:val="28"/>
+          <w:lang w:val="en-GB"/>
+        </w:rPr>
+        <w:t>REFERENCES</w:t>
       </w:r>
     </w:p>
     <w:p>
       <w:pPr>
         <w:pStyle w:val="Normal"/>
         <w:jc w:val="left"/>
-        <w:rPr>
-          <w:rFonts w:ascii="Times New Roman" w:hAnsi="Times New Roman" w:eastAsia="Times New Roman" w:cs="Times New Roman"/>
-          <w:b w:val="0"/>
-          <w:bCs w:val="0"/>
-          <w:color w:val="auto"/>
-          <w:sz w:val="24"/>
-          <w:szCs w:val="24"/>
-        </w:rPr>
-      </w:pPr>
+      </w:pPr>
+      <w:r>
+        <w:rPr>
+          <w:rFonts w:ascii="Times New Roman" w:hAnsi="Times New Roman" w:eastAsia="Times New Roman" w:cs="Times New Roman"/>
+          <w:noProof w:val="0"/>
+          <w:sz w:val="24"/>
+          <w:szCs w:val="24"/>
+          <w:lang w:val="en-GB"/>
+        </w:rPr>
+        <w:t>[1] Fortune Business Insights, "Smart Home Market Size, Share &amp; Industry Analysis," 2026. Available: https://www.fortunebusinessinsights.com/industry-reports/smart-home-market-101900 [Accessed: 01-Mar-2026].</w:t>
+      </w:r>
+    </w:p>
+    <w:p>
+      <w:pPr>
+        <w:pStyle w:val="Normal"/>
+        <w:jc w:val="left"/>
+      </w:pPr>
+      <w:r>
+        <w:rPr>
+          <w:rFonts w:ascii="Times New Roman" w:hAnsi="Times New Roman" w:eastAsia="Times New Roman" w:cs="Times New Roman"/>
+          <w:noProof w:val="0"/>
+          <w:sz w:val="24"/>
+          <w:szCs w:val="24"/>
+          <w:lang w:val="en-GB"/>
+        </w:rPr>
+        <w:t>[</w:t>
+      </w:r>
+      <w:r>
+        <w:rPr>
+          <w:rFonts w:ascii="Times New Roman" w:hAnsi="Times New Roman" w:eastAsia="Times New Roman" w:cs="Times New Roman"/>
+          <w:noProof w:val="0"/>
+          <w:sz w:val="24"/>
+          <w:szCs w:val="24"/>
+          <w:lang w:val="en-GB"/>
+        </w:rPr>
+        <w:t>2</w:t>
+      </w:r>
+      <w:r>
+        <w:rPr>
+          <w:rFonts w:ascii="Times New Roman" w:hAnsi="Times New Roman" w:eastAsia="Times New Roman" w:cs="Times New Roman"/>
+          <w:noProof w:val="0"/>
+          <w:sz w:val="24"/>
+          <w:szCs w:val="24"/>
+          <w:lang w:val="en-GB"/>
+        </w:rPr>
+        <w:t>] Precedence Research, "Smart Home Market Size and Forecast 2025 to 2034," 2025. Available: https://www.precedenceresearch.com/smart-home-market [Accessed: 01-Mar-2026]</w:t>
+      </w:r>
+    </w:p>
+    <w:p>
+      <w:pPr>
+        <w:pStyle w:val="Normal"/>
+        <w:jc w:val="left"/>
+      </w:pPr>
+      <w:r>
+        <w:rPr>
+          <w:rFonts w:ascii="Times New Roman" w:hAnsi="Times New Roman" w:eastAsia="Times New Roman" w:cs="Times New Roman"/>
+          <w:noProof w:val="0"/>
+          <w:sz w:val="24"/>
+          <w:szCs w:val="24"/>
+          <w:lang w:val="en-GB"/>
+        </w:rPr>
+        <w:t>[3] CO-DA, "How Homes Got Smart: A Look at the History of Smart Home Automation," 2023. Available: https://co-da.com/history-of-smart-home-automation/ [Accessed: 02-Mar-2026].</w:t>
+      </w:r>
+    </w:p>
+    <w:p>
+      <w:pPr>
+        <w:pStyle w:val="Normal"/>
+        <w:jc w:val="left"/>
+      </w:pPr>
+      <w:r>
+        <w:rPr>
+          <w:rFonts w:ascii="Times New Roman" w:hAnsi="Times New Roman" w:eastAsia="Times New Roman" w:cs="Times New Roman"/>
+          <w:noProof w:val="0"/>
+          <w:sz w:val="24"/>
+          <w:szCs w:val="24"/>
+          <w:lang w:val="en-GB"/>
+        </w:rPr>
+        <w:t>[4] Grand View Research, "Smart Home Market Size, Share &amp; Trends Report," 2025. Available: https://www.grandviewresearch.com/industry-analysis/smart-homes-industry [Accessed: 01-Mar-2026].</w:t>
+      </w:r>
     </w:p>
     <w:sectPr>
       <w:pgSz w:w="11906" w:h="16838" w:orient="portrait"/>
@@ -758,6 +1968,17 @@
     </w:sectPr>
   </w:body>
 </w:document>
+</file>
+
+<file path=word/intelligence2.xml><?xml version="1.0" encoding="utf-8"?>
+<int2:intelligence xmlns:int2="http://schemas.microsoft.com/office/intelligence/2020/intelligence">
+  <int2:observations>
+    <int2:bookmark int2:bookmarkName="_Int_57juEFqq" int2:invalidationBookmarkName="" int2:hashCode="G3BPsVE/TMVfRv" int2:id="Y86XA3IM">
+      <int2:state int2:type="style" int2:value="Rejected"/>
+    </int2:bookmark>
+  </int2:observations>
+  <int2:intelligenceSettings/>
+</int2:intelligence>
 </file>
 
 <file path=word/numbering.xml><?xml version="1.0" encoding="utf-8"?>
@@ -1313,6 +2534,17 @@
       <w:contextualSpacing/>
     </w:pPr>
   </w:style>
+  <w:style w:type="character" w:styleId="Hyperlink">
+    <w:uiPriority w:val="99"/>
+    <w:name w:val="Hyperlink"/>
+    <w:basedOn w:val="DefaultParagraphFont"/>
+    <w:unhideWhenUsed/>
+    <w:rsid w:val="5CC00FAF"/>
+    <w:rPr>
+      <w:color w:val="467886"/>
+      <w:u w:val="single"/>
+    </w:rPr>
+  </w:style>
 </w:styles>
 </file>
 

</xml_diff>